<commit_message>
Add business value, decision rules, governance section and one-click Colab setup
</commit_message>
<xml_diff>
--- a/report/BI_Term_Project_Report_AyeThadarSoe.docx
+++ b/report/BI_Term_Project_Report_AyeThadarSoe.docx
@@ -97,7 +97,7 @@
         <w:t xml:space="preserve">Code:</w:t>
       </w:r>
       <w:r>
-        <w:t xml:space="preserve"> analysis.ipynb, recsys.py (submitted with this report; see README.md)</w:t>
+        <w:t xml:space="preserve"> analysis.ipynb and recsys.py, submitted with this report and at https://github.com/ava-builds/bi-cross-market-recsys (runs in Google Colab; see README.md)</w:t>
       </w:r>
     </w:p>
     <w:p>
@@ -134,7 +134,7 @@
         <w:t xml:space="preserve">per market</w:t>
       </w:r>
       <w:r>
-        <w:t xml:space="preserve">, using measured distinctiveness and validation data, rather than one global rule.</w:t>
+        <w:t xml:space="preserve">, using validation data, rather than one global rule: on the test trips this produced 547 more correct suggestions than a single pooled model for everyone.</w:t>
       </w:r>
     </w:p>
     <w:p>
@@ -324,6 +324,764 @@
     </w:p>
     <w:p>
       <w:pPr>
+        <w:spacing w:after="120" w:line="288"/>
+        <w:jc w:val="both"/>
+      </w:pPr>
+      <w:r>
+        <w:t xml:space="preserve">The report follows the six questions that guide every project in this course:</w:t>
+      </w:r>
+    </w:p>
+    <w:tbl>
+      <w:tblPr>
+        <w:tblW w:type="dxa" w:w="9638"/>
+        <w:tblBorders>
+          <w:top w:val="single" w:color="auto" w:sz="4"/>
+          <w:left w:val="single" w:color="auto" w:sz="4"/>
+          <w:bottom w:val="single" w:color="auto" w:sz="4"/>
+          <w:right w:val="single" w:color="auto" w:sz="4"/>
+          <w:insideH w:val="single" w:color="auto" w:sz="4"/>
+          <w:insideV w:val="single" w:color="auto" w:sz="4"/>
+        </w:tblBorders>
+      </w:tblPr>
+      <w:tblGrid>
+        <w:gridCol w:w="3500"/>
+        <w:gridCol w:w="4638"/>
+        <w:gridCol w:w="1500"/>
+      </w:tblGrid>
+      <w:tr>
+        <w:trPr>
+          <w:cantSplit/>
+          <w:tblHeader/>
+        </w:trPr>
+        <w:tc>
+          <w:tcPr>
+            <w:tcW w:type="dxa" w:w="3500"/>
+            <w:tcBorders>
+              <w:top w:val="single" w:color="BFBFBF" w:sz="4"/>
+              <w:left w:val="single" w:color="BFBFBF" w:sz="4"/>
+              <w:bottom w:val="single" w:color="BFBFBF" w:sz="4"/>
+              <w:right w:val="single" w:color="BFBFBF" w:sz="4"/>
+            </w:tcBorders>
+            <w:shd w:fill="E8EEF6" w:color="auto" w:val="clear"/>
+            <w:tcMar>
+              <w:top w:type="dxa" w:w="60"/>
+              <w:left w:type="dxa" w:w="100"/>
+              <w:bottom w:type="dxa" w:w="60"/>
+              <w:right w:type="dxa" w:w="100"/>
+            </w:tcMar>
+          </w:tcPr>
+          <w:p>
+            <w:pPr>
+              <w:keepNext/>
+              <w:keepLines/>
+              <w:spacing w:after="0"/>
+              <w:jc w:val="left"/>
+            </w:pPr>
+            <w:r>
+              <w:rPr>
+                <w:b/>
+                <w:bCs/>
+                <w:sz w:val="18"/>
+                <w:szCs w:val="18"/>
+              </w:rPr>
+              <w:t xml:space="preserve">Course question</w:t>
+            </w:r>
+          </w:p>
+        </w:tc>
+        <w:tc>
+          <w:tcPr>
+            <w:tcW w:type="dxa" w:w="4638"/>
+            <w:tcBorders>
+              <w:top w:val="single" w:color="BFBFBF" w:sz="4"/>
+              <w:left w:val="single" w:color="BFBFBF" w:sz="4"/>
+              <w:bottom w:val="single" w:color="BFBFBF" w:sz="4"/>
+              <w:right w:val="single" w:color="BFBFBF" w:sz="4"/>
+            </w:tcBorders>
+            <w:shd w:fill="E8EEF6" w:color="auto" w:val="clear"/>
+            <w:tcMar>
+              <w:top w:type="dxa" w:w="60"/>
+              <w:left w:type="dxa" w:w="100"/>
+              <w:bottom w:type="dxa" w:w="60"/>
+              <w:right w:type="dxa" w:w="100"/>
+            </w:tcMar>
+          </w:tcPr>
+          <w:p>
+            <w:pPr>
+              <w:keepNext/>
+              <w:keepLines/>
+              <w:spacing w:after="0"/>
+              <w:jc w:val="left"/>
+            </w:pPr>
+            <w:r>
+              <w:rPr>
+                <w:b/>
+                <w:bCs/>
+                <w:sz w:val="18"/>
+                <w:szCs w:val="18"/>
+              </w:rPr>
+              <w:t xml:space="preserve">Answer in this project</w:t>
+            </w:r>
+          </w:p>
+        </w:tc>
+        <w:tc>
+          <w:tcPr>
+            <w:tcW w:type="dxa" w:w="1500"/>
+            <w:tcBorders>
+              <w:top w:val="single" w:color="BFBFBF" w:sz="4"/>
+              <w:left w:val="single" w:color="BFBFBF" w:sz="4"/>
+              <w:bottom w:val="single" w:color="BFBFBF" w:sz="4"/>
+              <w:right w:val="single" w:color="BFBFBF" w:sz="4"/>
+            </w:tcBorders>
+            <w:shd w:fill="E8EEF6" w:color="auto" w:val="clear"/>
+            <w:tcMar>
+              <w:top w:type="dxa" w:w="60"/>
+              <w:left w:type="dxa" w:w="100"/>
+              <w:bottom w:type="dxa" w:w="60"/>
+              <w:right w:type="dxa" w:w="100"/>
+            </w:tcMar>
+          </w:tcPr>
+          <w:p>
+            <w:pPr>
+              <w:keepNext/>
+              <w:keepLines/>
+              <w:spacing w:after="0"/>
+              <w:jc w:val="left"/>
+            </w:pPr>
+            <w:r>
+              <w:rPr>
+                <w:b/>
+                <w:bCs/>
+                <w:sz w:val="18"/>
+                <w:szCs w:val="18"/>
+              </w:rPr>
+              <w:t xml:space="preserve">Section</w:t>
+            </w:r>
+          </w:p>
+        </w:tc>
+      </w:tr>
+      <w:tr>
+        <w:trPr>
+          <w:cantSplit/>
+        </w:trPr>
+        <w:tc>
+          <w:tcPr>
+            <w:tcW w:type="dxa" w:w="3500"/>
+            <w:tcBorders>
+              <w:top w:val="single" w:color="BFBFBF" w:sz="4"/>
+              <w:left w:val="single" w:color="BFBFBF" w:sz="4"/>
+              <w:bottom w:val="single" w:color="BFBFBF" w:sz="4"/>
+              <w:right w:val="single" w:color="BFBFBF" w:sz="4"/>
+            </w:tcBorders>
+            <w:tcMar>
+              <w:top w:type="dxa" w:w="60"/>
+              <w:left w:type="dxa" w:w="100"/>
+              <w:bottom w:type="dxa" w:w="60"/>
+              <w:right w:type="dxa" w:w="100"/>
+            </w:tcMar>
+          </w:tcPr>
+          <w:p>
+            <w:pPr>
+              <w:keepNext/>
+              <w:keepLines/>
+              <w:spacing w:after="0"/>
+              <w:jc w:val="left"/>
+            </w:pPr>
+            <w:r>
+              <w:rPr>
+                <w:sz w:val="18"/>
+                <w:szCs w:val="18"/>
+              </w:rPr>
+              <w:t xml:space="preserve">DECISION: which business choice needs evidence?</w:t>
+            </w:r>
+          </w:p>
+        </w:tc>
+        <w:tc>
+          <w:tcPr>
+            <w:tcW w:type="dxa" w:w="4638"/>
+            <w:tcBorders>
+              <w:top w:val="single" w:color="BFBFBF" w:sz="4"/>
+              <w:left w:val="single" w:color="BFBFBF" w:sz="4"/>
+              <w:bottom w:val="single" w:color="BFBFBF" w:sz="4"/>
+              <w:right w:val="single" w:color="BFBFBF" w:sz="4"/>
+            </w:tcBorders>
+            <w:tcMar>
+              <w:top w:type="dxa" w:w="60"/>
+              <w:left w:type="dxa" w:w="100"/>
+              <w:bottom w:type="dxa" w:w="60"/>
+              <w:right w:type="dxa" w:w="100"/>
+            </w:tcMar>
+          </w:tcPr>
+          <w:p>
+            <w:pPr>
+              <w:keepNext/>
+              <w:keepLines/>
+              <w:spacing w:after="0"/>
+              <w:jc w:val="left"/>
+            </w:pPr>
+            <w:r>
+              <w:rPr>
+                <w:sz w:val="18"/>
+                <w:szCs w:val="18"/>
+              </w:rPr>
+              <w:t xml:space="preserve">Own, pooled or blended training data for each booker market</w:t>
+            </w:r>
+          </w:p>
+        </w:tc>
+        <w:tc>
+          <w:tcPr>
+            <w:tcW w:type="dxa" w:w="1500"/>
+            <w:tcBorders>
+              <w:top w:val="single" w:color="BFBFBF" w:sz="4"/>
+              <w:left w:val="single" w:color="BFBFBF" w:sz="4"/>
+              <w:bottom w:val="single" w:color="BFBFBF" w:sz="4"/>
+              <w:right w:val="single" w:color="BFBFBF" w:sz="4"/>
+            </w:tcBorders>
+            <w:tcMar>
+              <w:top w:type="dxa" w:w="60"/>
+              <w:left w:type="dxa" w:w="100"/>
+              <w:bottom w:type="dxa" w:w="60"/>
+              <w:right w:type="dxa" w:w="100"/>
+            </w:tcMar>
+          </w:tcPr>
+          <w:p>
+            <w:pPr>
+              <w:keepNext/>
+              <w:keepLines/>
+              <w:spacing w:after="0"/>
+              <w:jc w:val="left"/>
+            </w:pPr>
+            <w:r>
+              <w:rPr>
+                <w:sz w:val="18"/>
+                <w:szCs w:val="18"/>
+              </w:rPr>
+              <w:t xml:space="preserve">1</w:t>
+            </w:r>
+          </w:p>
+        </w:tc>
+      </w:tr>
+      <w:tr>
+        <w:trPr>
+          <w:cantSplit/>
+        </w:trPr>
+        <w:tc>
+          <w:tcPr>
+            <w:tcW w:type="dxa" w:w="3500"/>
+            <w:tcBorders>
+              <w:top w:val="single" w:color="BFBFBF" w:sz="4"/>
+              <w:left w:val="single" w:color="BFBFBF" w:sz="4"/>
+              <w:bottom w:val="single" w:color="BFBFBF" w:sz="4"/>
+              <w:right w:val="single" w:color="BFBFBF" w:sz="4"/>
+            </w:tcBorders>
+            <w:tcMar>
+              <w:top w:type="dxa" w:w="60"/>
+              <w:left w:type="dxa" w:w="100"/>
+              <w:bottom w:type="dxa" w:w="60"/>
+              <w:right w:type="dxa" w:w="100"/>
+            </w:tcMar>
+          </w:tcPr>
+          <w:p>
+            <w:pPr>
+              <w:keepNext/>
+              <w:keepLines/>
+              <w:spacing w:after="0"/>
+              <w:jc w:val="left"/>
+            </w:pPr>
+            <w:r>
+              <w:rPr>
+                <w:sz w:val="18"/>
+                <w:szCs w:val="18"/>
+              </w:rPr>
+              <w:t xml:space="preserve">DATA: which sources represent the problem?</w:t>
+            </w:r>
+          </w:p>
+        </w:tc>
+        <w:tc>
+          <w:tcPr>
+            <w:tcW w:type="dxa" w:w="4638"/>
+            <w:tcBorders>
+              <w:top w:val="single" w:color="BFBFBF" w:sz="4"/>
+              <w:left w:val="single" w:color="BFBFBF" w:sz="4"/>
+              <w:bottom w:val="single" w:color="BFBFBF" w:sz="4"/>
+              <w:right w:val="single" w:color="BFBFBF" w:sz="4"/>
+            </w:tcBorders>
+            <w:tcMar>
+              <w:top w:type="dxa" w:w="60"/>
+              <w:left w:type="dxa" w:w="100"/>
+              <w:bottom w:type="dxa" w:w="60"/>
+              <w:right w:type="dxa" w:w="100"/>
+            </w:tcMar>
+          </w:tcPr>
+          <w:p>
+            <w:pPr>
+              <w:keepNext/>
+              <w:keepLines/>
+              <w:spacing w:after="0"/>
+              <w:jc w:val="left"/>
+            </w:pPr>
+            <w:r>
+              <w:rPr>
+                <w:sz w:val="18"/>
+                <w:szCs w:val="18"/>
+              </w:rPr>
+              <w:t xml:space="preserve">Booking.com Multi-Destination Trips, five booker markets</w:t>
+            </w:r>
+          </w:p>
+        </w:tc>
+        <w:tc>
+          <w:tcPr>
+            <w:tcW w:type="dxa" w:w="1500"/>
+            <w:tcBorders>
+              <w:top w:val="single" w:color="BFBFBF" w:sz="4"/>
+              <w:left w:val="single" w:color="BFBFBF" w:sz="4"/>
+              <w:bottom w:val="single" w:color="BFBFBF" w:sz="4"/>
+              <w:right w:val="single" w:color="BFBFBF" w:sz="4"/>
+            </w:tcBorders>
+            <w:tcMar>
+              <w:top w:type="dxa" w:w="60"/>
+              <w:left w:type="dxa" w:w="100"/>
+              <w:bottom w:type="dxa" w:w="60"/>
+              <w:right w:type="dxa" w:w="100"/>
+            </w:tcMar>
+          </w:tcPr>
+          <w:p>
+            <w:pPr>
+              <w:keepNext/>
+              <w:keepLines/>
+              <w:spacing w:after="0"/>
+              <w:jc w:val="left"/>
+            </w:pPr>
+            <w:r>
+              <w:rPr>
+                <w:sz w:val="18"/>
+                <w:szCs w:val="18"/>
+              </w:rPr>
+              <w:t xml:space="preserve">2</w:t>
+            </w:r>
+          </w:p>
+        </w:tc>
+      </w:tr>
+      <w:tr>
+        <w:trPr>
+          <w:cantSplit/>
+        </w:trPr>
+        <w:tc>
+          <w:tcPr>
+            <w:tcW w:type="dxa" w:w="3500"/>
+            <w:tcBorders>
+              <w:top w:val="single" w:color="BFBFBF" w:sz="4"/>
+              <w:left w:val="single" w:color="BFBFBF" w:sz="4"/>
+              <w:bottom w:val="single" w:color="BFBFBF" w:sz="4"/>
+              <w:right w:val="single" w:color="BFBFBF" w:sz="4"/>
+            </w:tcBorders>
+            <w:tcMar>
+              <w:top w:type="dxa" w:w="60"/>
+              <w:left w:type="dxa" w:w="100"/>
+              <w:bottom w:type="dxa" w:w="60"/>
+              <w:right w:type="dxa" w:w="100"/>
+            </w:tcMar>
+          </w:tcPr>
+          <w:p>
+            <w:pPr>
+              <w:keepNext/>
+              <w:keepLines/>
+              <w:spacing w:after="0"/>
+              <w:jc w:val="left"/>
+            </w:pPr>
+            <w:r>
+              <w:rPr>
+                <w:sz w:val="18"/>
+                <w:szCs w:val="18"/>
+              </w:rPr>
+              <w:t xml:space="preserve">PIPELINE: how does data move and remain traceable?</w:t>
+            </w:r>
+          </w:p>
+        </w:tc>
+        <w:tc>
+          <w:tcPr>
+            <w:tcW w:type="dxa" w:w="4638"/>
+            <w:tcBorders>
+              <w:top w:val="single" w:color="BFBFBF" w:sz="4"/>
+              <w:left w:val="single" w:color="BFBFBF" w:sz="4"/>
+              <w:bottom w:val="single" w:color="BFBFBF" w:sz="4"/>
+              <w:right w:val="single" w:color="BFBFBF" w:sz="4"/>
+            </w:tcBorders>
+            <w:tcMar>
+              <w:top w:type="dxa" w:w="60"/>
+              <w:left w:type="dxa" w:w="100"/>
+              <w:bottom w:type="dxa" w:w="60"/>
+              <w:right w:type="dxa" w:w="100"/>
+            </w:tcMar>
+          </w:tcPr>
+          <w:p>
+            <w:pPr>
+              <w:keepNext/>
+              <w:keepLines/>
+              <w:spacing w:after="0"/>
+              <w:jc w:val="left"/>
+            </w:pPr>
+            <w:r>
+              <w:rPr>
+                <w:sz w:val="18"/>
+                <w:szCs w:val="18"/>
+              </w:rPr>
+              <w:t xml:space="preserve">Official split, validation split, one notebook that regenerates every number</w:t>
+            </w:r>
+          </w:p>
+        </w:tc>
+        <w:tc>
+          <w:tcPr>
+            <w:tcW w:type="dxa" w:w="1500"/>
+            <w:tcBorders>
+              <w:top w:val="single" w:color="BFBFBF" w:sz="4"/>
+              <w:left w:val="single" w:color="BFBFBF" w:sz="4"/>
+              <w:bottom w:val="single" w:color="BFBFBF" w:sz="4"/>
+              <w:right w:val="single" w:color="BFBFBF" w:sz="4"/>
+            </w:tcBorders>
+            <w:tcMar>
+              <w:top w:type="dxa" w:w="60"/>
+              <w:left w:type="dxa" w:w="100"/>
+              <w:bottom w:type="dxa" w:w="60"/>
+              <w:right w:type="dxa" w:w="100"/>
+            </w:tcMar>
+          </w:tcPr>
+          <w:p>
+            <w:pPr>
+              <w:keepNext/>
+              <w:keepLines/>
+              <w:spacing w:after="0"/>
+              <w:jc w:val="left"/>
+            </w:pPr>
+            <w:r>
+              <w:rPr>
+                <w:sz w:val="18"/>
+                <w:szCs w:val="18"/>
+              </w:rPr>
+              <w:t xml:space="preserve">3.3, Appendix</w:t>
+            </w:r>
+          </w:p>
+        </w:tc>
+      </w:tr>
+      <w:tr>
+        <w:trPr>
+          <w:cantSplit/>
+        </w:trPr>
+        <w:tc>
+          <w:tcPr>
+            <w:tcW w:type="dxa" w:w="3500"/>
+            <w:tcBorders>
+              <w:top w:val="single" w:color="BFBFBF" w:sz="4"/>
+              <w:left w:val="single" w:color="BFBFBF" w:sz="4"/>
+              <w:bottom w:val="single" w:color="BFBFBF" w:sz="4"/>
+              <w:right w:val="single" w:color="BFBFBF" w:sz="4"/>
+            </w:tcBorders>
+            <w:tcMar>
+              <w:top w:type="dxa" w:w="60"/>
+              <w:left w:type="dxa" w:w="100"/>
+              <w:bottom w:type="dxa" w:w="60"/>
+              <w:right w:type="dxa" w:w="100"/>
+            </w:tcMar>
+          </w:tcPr>
+          <w:p>
+            <w:pPr>
+              <w:keepNext/>
+              <w:keepLines/>
+              <w:spacing w:after="0"/>
+              <w:jc w:val="left"/>
+            </w:pPr>
+            <w:r>
+              <w:rPr>
+                <w:sz w:val="18"/>
+                <w:szCs w:val="18"/>
+              </w:rPr>
+              <w:t xml:space="preserve">METHOD: which analysis fits the question?</w:t>
+            </w:r>
+          </w:p>
+        </w:tc>
+        <w:tc>
+          <w:tcPr>
+            <w:tcW w:type="dxa" w:w="4638"/>
+            <w:tcBorders>
+              <w:top w:val="single" w:color="BFBFBF" w:sz="4"/>
+              <w:left w:val="single" w:color="BFBFBF" w:sz="4"/>
+              <w:bottom w:val="single" w:color="BFBFBF" w:sz="4"/>
+              <w:right w:val="single" w:color="BFBFBF" w:sz="4"/>
+            </w:tcBorders>
+            <w:tcMar>
+              <w:top w:type="dxa" w:w="60"/>
+              <w:left w:type="dxa" w:w="100"/>
+              <w:bottom w:type="dxa" w:w="60"/>
+              <w:right w:type="dxa" w:w="100"/>
+            </w:tcMar>
+          </w:tcPr>
+          <w:p>
+            <w:pPr>
+              <w:keepNext/>
+              <w:keepLines/>
+              <w:spacing w:after="0"/>
+              <w:jc w:val="left"/>
+            </w:pPr>
+            <w:r>
+              <w:rPr>
+                <w:sz w:val="18"/>
+                <w:szCs w:val="18"/>
+              </w:rPr>
+              <w:t xml:space="preserve">Controlled comparison of one counting model trained on different data</w:t>
+            </w:r>
+          </w:p>
+        </w:tc>
+        <w:tc>
+          <w:tcPr>
+            <w:tcW w:type="dxa" w:w="1500"/>
+            <w:tcBorders>
+              <w:top w:val="single" w:color="BFBFBF" w:sz="4"/>
+              <w:left w:val="single" w:color="BFBFBF" w:sz="4"/>
+              <w:bottom w:val="single" w:color="BFBFBF" w:sz="4"/>
+              <w:right w:val="single" w:color="BFBFBF" w:sz="4"/>
+            </w:tcBorders>
+            <w:tcMar>
+              <w:top w:type="dxa" w:w="60"/>
+              <w:left w:type="dxa" w:w="100"/>
+              <w:bottom w:type="dxa" w:w="60"/>
+              <w:right w:type="dxa" w:w="100"/>
+            </w:tcMar>
+          </w:tcPr>
+          <w:p>
+            <w:pPr>
+              <w:keepNext/>
+              <w:keepLines/>
+              <w:spacing w:after="0"/>
+              <w:jc w:val="left"/>
+            </w:pPr>
+            <w:r>
+              <w:rPr>
+                <w:sz w:val="18"/>
+                <w:szCs w:val="18"/>
+              </w:rPr>
+              <w:t xml:space="preserve">3</w:t>
+            </w:r>
+          </w:p>
+        </w:tc>
+      </w:tr>
+      <w:tr>
+        <w:trPr>
+          <w:cantSplit/>
+        </w:trPr>
+        <w:tc>
+          <w:tcPr>
+            <w:tcW w:type="dxa" w:w="3500"/>
+            <w:tcBorders>
+              <w:top w:val="single" w:color="BFBFBF" w:sz="4"/>
+              <w:left w:val="single" w:color="BFBFBF" w:sz="4"/>
+              <w:bottom w:val="single" w:color="BFBFBF" w:sz="4"/>
+              <w:right w:val="single" w:color="BFBFBF" w:sz="4"/>
+            </w:tcBorders>
+            <w:tcMar>
+              <w:top w:type="dxa" w:w="60"/>
+              <w:left w:type="dxa" w:w="100"/>
+              <w:bottom w:type="dxa" w:w="60"/>
+              <w:right w:type="dxa" w:w="100"/>
+            </w:tcMar>
+          </w:tcPr>
+          <w:p>
+            <w:pPr>
+              <w:keepNext/>
+              <w:keepLines/>
+              <w:spacing w:after="0"/>
+              <w:jc w:val="left"/>
+            </w:pPr>
+            <w:r>
+              <w:rPr>
+                <w:sz w:val="18"/>
+                <w:szCs w:val="18"/>
+              </w:rPr>
+              <w:t xml:space="preserve">VALUE: which outcome should improve?</w:t>
+            </w:r>
+          </w:p>
+        </w:tc>
+        <w:tc>
+          <w:tcPr>
+            <w:tcW w:type="dxa" w:w="4638"/>
+            <w:tcBorders>
+              <w:top w:val="single" w:color="BFBFBF" w:sz="4"/>
+              <w:left w:val="single" w:color="BFBFBF" w:sz="4"/>
+              <w:bottom w:val="single" w:color="BFBFBF" w:sz="4"/>
+              <w:right w:val="single" w:color="BFBFBF" w:sz="4"/>
+            </w:tcBorders>
+            <w:tcMar>
+              <w:top w:type="dxa" w:w="60"/>
+              <w:left w:type="dxa" w:w="100"/>
+              <w:bottom w:type="dxa" w:w="60"/>
+              <w:right w:type="dxa" w:w="100"/>
+            </w:tcMar>
+          </w:tcPr>
+          <w:p>
+            <w:pPr>
+              <w:keepNext/>
+              <w:keepLines/>
+              <w:spacing w:after="0"/>
+              <w:jc w:val="left"/>
+            </w:pPr>
+            <w:r>
+              <w:rPr>
+                <w:sz w:val="18"/>
+                <w:szCs w:val="18"/>
+              </w:rPr>
+              <w:t xml:space="preserve">Recall@4 and the number of correct suggestions</w:t>
+            </w:r>
+          </w:p>
+        </w:tc>
+        <w:tc>
+          <w:tcPr>
+            <w:tcW w:type="dxa" w:w="1500"/>
+            <w:tcBorders>
+              <w:top w:val="single" w:color="BFBFBF" w:sz="4"/>
+              <w:left w:val="single" w:color="BFBFBF" w:sz="4"/>
+              <w:bottom w:val="single" w:color="BFBFBF" w:sz="4"/>
+              <w:right w:val="single" w:color="BFBFBF" w:sz="4"/>
+            </w:tcBorders>
+            <w:tcMar>
+              <w:top w:type="dxa" w:w="60"/>
+              <w:left w:type="dxa" w:w="100"/>
+              <w:bottom w:type="dxa" w:w="60"/>
+              <w:right w:type="dxa" w:w="100"/>
+            </w:tcMar>
+          </w:tcPr>
+          <w:p>
+            <w:pPr>
+              <w:keepNext/>
+              <w:keepLines/>
+              <w:spacing w:after="0"/>
+              <w:jc w:val="left"/>
+            </w:pPr>
+            <w:r>
+              <w:rPr>
+                <w:sz w:val="18"/>
+                <w:szCs w:val="18"/>
+              </w:rPr>
+              <w:t xml:space="preserve">4, 6.2</w:t>
+            </w:r>
+          </w:p>
+        </w:tc>
+      </w:tr>
+      <w:tr>
+        <w:trPr>
+          <w:cantSplit/>
+        </w:trPr>
+        <w:tc>
+          <w:tcPr>
+            <w:tcW w:type="dxa" w:w="3500"/>
+            <w:tcBorders>
+              <w:top w:val="single" w:color="BFBFBF" w:sz="4"/>
+              <w:left w:val="single" w:color="BFBFBF" w:sz="4"/>
+              <w:bottom w:val="single" w:color="BFBFBF" w:sz="4"/>
+              <w:right w:val="single" w:color="BFBFBF" w:sz="4"/>
+            </w:tcBorders>
+            <w:tcMar>
+              <w:top w:type="dxa" w:w="60"/>
+              <w:left w:type="dxa" w:w="100"/>
+              <w:bottom w:type="dxa" w:w="60"/>
+              <w:right w:type="dxa" w:w="100"/>
+            </w:tcMar>
+          </w:tcPr>
+          <w:p>
+            <w:pPr>
+              <w:keepNext/>
+              <w:keepLines/>
+              <w:spacing w:after="0"/>
+              <w:jc w:val="left"/>
+            </w:pPr>
+            <w:r>
+              <w:rPr>
+                <w:sz w:val="18"/>
+                <w:szCs w:val="18"/>
+              </w:rPr>
+              <w:t xml:space="preserve">GOVERNANCE: who reviews risks and consequences?</w:t>
+            </w:r>
+          </w:p>
+        </w:tc>
+        <w:tc>
+          <w:tcPr>
+            <w:tcW w:type="dxa" w:w="4638"/>
+            <w:tcBorders>
+              <w:top w:val="single" w:color="BFBFBF" w:sz="4"/>
+              <w:left w:val="single" w:color="BFBFBF" w:sz="4"/>
+              <w:bottom w:val="single" w:color="BFBFBF" w:sz="4"/>
+              <w:right w:val="single" w:color="BFBFBF" w:sz="4"/>
+            </w:tcBorders>
+            <w:tcMar>
+              <w:top w:type="dxa" w:w="60"/>
+              <w:left w:type="dxa" w:w="100"/>
+              <w:bottom w:type="dxa" w:w="60"/>
+              <w:right w:type="dxa" w:w="100"/>
+            </w:tcMar>
+          </w:tcPr>
+          <w:p>
+            <w:pPr>
+              <w:keepNext/>
+              <w:keepLines/>
+              <w:spacing w:after="0"/>
+              <w:jc w:val="left"/>
+            </w:pPr>
+            <w:r>
+              <w:rPr>
+                <w:sz w:val="18"/>
+                <w:szCs w:val="18"/>
+              </w:rPr>
+              <w:t xml:space="preserve">Privacy, terms, fairness across markets, monitoring</w:t>
+            </w:r>
+          </w:p>
+        </w:tc>
+        <w:tc>
+          <w:tcPr>
+            <w:tcW w:type="dxa" w:w="1500"/>
+            <w:tcBorders>
+              <w:top w:val="single" w:color="BFBFBF" w:sz="4"/>
+              <w:left w:val="single" w:color="BFBFBF" w:sz="4"/>
+              <w:bottom w:val="single" w:color="BFBFBF" w:sz="4"/>
+              <w:right w:val="single" w:color="BFBFBF" w:sz="4"/>
+            </w:tcBorders>
+            <w:tcMar>
+              <w:top w:type="dxa" w:w="60"/>
+              <w:left w:type="dxa" w:w="100"/>
+              <w:bottom w:type="dxa" w:w="60"/>
+              <w:right w:type="dxa" w:w="100"/>
+            </w:tcMar>
+          </w:tcPr>
+          <w:p>
+            <w:pPr>
+              <w:keepNext/>
+              <w:keepLines/>
+              <w:spacing w:after="0"/>
+              <w:jc w:val="left"/>
+            </w:pPr>
+            <w:r>
+              <w:rPr>
+                <w:sz w:val="18"/>
+                <w:szCs w:val="18"/>
+              </w:rPr>
+              <w:t xml:space="preserve">7</w:t>
+            </w:r>
+          </w:p>
+        </w:tc>
+      </w:tr>
+    </w:tbl>
+    <w:p>
+      <w:pPr>
+        <w:spacing w:after="200" w:before="60"/>
+        <w:jc w:val="left"/>
+      </w:pPr>
+      <w:r>
+        <w:rPr>
+          <w:color w:val="52514E"/>
+          <w:sz w:val="18"/>
+          <w:szCs w:val="18"/>
+        </w:rPr>
+        <w:t xml:space="preserve">How this report answers the course's six guiding questions.</w:t>
+      </w:r>
+    </w:p>
+    <w:p>
+      <w:pPr>
         <w:pStyle w:val="Heading1"/>
       </w:pPr>
       <w:r>
@@ -375,7 +1133,7 @@
         <w:t xml:space="preserve">Anonymisation.</w:t>
       </w:r>
       <w:r>
-        <w:t xml:space="preserve"> Countries carry fictional names (e.g., "Gondal") and cities carry numeric IDs. booker_country is the country the reservation was made from, not nationality or culture. Because the mapping to real countries is not disclosed, the data cannot be joined with external cultural data such as the World Values Survey. Section 7 discusses this limitation.</w:t>
+        <w:t xml:space="preserve"> Countries carry fictional names (e.g., "Gondal") and cities carry numeric IDs. booker_country is the country the reservation was made from, not nationality or culture. Because the mapping to real countries is not disclosed, the data cannot be joined with external cultural data such as the World Values Survey. Section 8 discusses this limitation.</w:t>
       </w:r>
     </w:p>
     <w:p>
@@ -7683,6 +8441,14 @@
     </w:p>
     <w:p>
       <w:pPr>
+        <w:pStyle w:val="Heading2"/>
+      </w:pPr>
+      <w:r>
+        <w:t xml:space="preserve">6.1 Hypotheses</w:t>
+      </w:r>
+    </w:p>
+    <w:p>
+      <w:pPr>
         <w:spacing w:after="120" w:line="288"/>
         <w:jc w:val="both"/>
       </w:pPr>
@@ -7709,91 +8475,2267 @@
     </w:p>
     <w:p>
       <w:pPr>
+        <w:pStyle w:val="Heading2"/>
+      </w:pPr>
+      <w:r>
+        <w:t xml:space="preserve">6.2 Business value</w:t>
+      </w:r>
+    </w:p>
+    <w:p>
+      <w:pPr>
         <w:spacing w:after="120" w:line="288"/>
         <w:jc w:val="both"/>
       </w:pPr>
       <w:r>
-        <w:t xml:space="preserve">For the platform, this translates into a simple policy:</w:t>
-      </w:r>
-    </w:p>
-    <w:p>
-      <w:pPr>
-        <w:pStyle w:val="ListParagraph"/>
-        <w:numPr>
-          <w:ilvl w:val="0"/>
-          <w:numId w:val="3"/>
-        </w:numPr>
-        <w:spacing w:after="60" w:line="276"/>
-      </w:pPr>
+        <w:t xml:space="preserve">Percentage points are hard to act on, so Table 6 counts </w:t>
+      </w:r>
       <w:r>
         <w:rPr>
           <w:b/>
           <w:bCs/>
         </w:rPr>
-        <w:t xml:space="preserve">Launch a new market on pooled or blended data.</w:t>
-      </w:r>
-      <w:r>
-        <w:t xml:space="preserve"> At the start, even a distinctive market is better served by borrowing data.</w:t>
+        <w:t xml:space="preserve">correct next-city suggestions</w:t>
+      </w:r>
+      <w:r>
+        <w:t xml:space="preserve"> (the true next city was in the top 4) on the 70,662 test trips. The validation data, never the test set, decides which source each market uses: validation leaned towards own data for The Devilfire Empire and Tcherkistan (α = 0.6 and 0.9) and towards pooled data for the other three (α ≤ 0.4), which matched the test winner in all five markets.</w:t>
+      </w:r>
+    </w:p>
+    <w:tbl>
+      <w:tblPr>
+        <w:tblW w:type="dxa" w:w="9638"/>
+        <w:tblBorders>
+          <w:top w:val="single" w:color="auto" w:sz="4"/>
+          <w:left w:val="single" w:color="auto" w:sz="4"/>
+          <w:bottom w:val="single" w:color="auto" w:sz="4"/>
+          <w:right w:val="single" w:color="auto" w:sz="4"/>
+          <w:insideH w:val="single" w:color="auto" w:sz="4"/>
+          <w:insideV w:val="single" w:color="auto" w:sz="4"/>
+        </w:tblBorders>
+      </w:tblPr>
+      <w:tblGrid>
+        <w:gridCol w:w="1800"/>
+        <w:gridCol w:w="1100"/>
+        <w:gridCol w:w="1250"/>
+        <w:gridCol w:w="1300"/>
+        <w:gridCol w:w="1250"/>
+        <w:gridCol w:w="1350"/>
+        <w:gridCol w:w="1588"/>
+      </w:tblGrid>
+      <w:tr>
+        <w:trPr>
+          <w:cantSplit/>
+          <w:tblHeader/>
+        </w:trPr>
+        <w:tc>
+          <w:tcPr>
+            <w:tcW w:type="dxa" w:w="1800"/>
+            <w:tcBorders>
+              <w:top w:val="single" w:color="BFBFBF" w:sz="4"/>
+              <w:left w:val="single" w:color="BFBFBF" w:sz="4"/>
+              <w:bottom w:val="single" w:color="BFBFBF" w:sz="4"/>
+              <w:right w:val="single" w:color="BFBFBF" w:sz="4"/>
+            </w:tcBorders>
+            <w:shd w:fill="E8EEF6" w:color="auto" w:val="clear"/>
+            <w:tcMar>
+              <w:top w:type="dxa" w:w="60"/>
+              <w:left w:type="dxa" w:w="100"/>
+              <w:bottom w:type="dxa" w:w="60"/>
+              <w:right w:type="dxa" w:w="100"/>
+            </w:tcMar>
+          </w:tcPr>
+          <w:p>
+            <w:pPr>
+              <w:keepNext/>
+              <w:keepLines/>
+              <w:spacing w:after="0"/>
+              <w:jc w:val="left"/>
+            </w:pPr>
+            <w:r>
+              <w:rPr>
+                <w:b/>
+                <w:bCs/>
+                <w:sz w:val="18"/>
+                <w:szCs w:val="18"/>
+              </w:rPr>
+              <w:t xml:space="preserve">Market</w:t>
+            </w:r>
+          </w:p>
+        </w:tc>
+        <w:tc>
+          <w:tcPr>
+            <w:tcW w:type="dxa" w:w="1100"/>
+            <w:tcBorders>
+              <w:top w:val="single" w:color="BFBFBF" w:sz="4"/>
+              <w:left w:val="single" w:color="BFBFBF" w:sz="4"/>
+              <w:bottom w:val="single" w:color="BFBFBF" w:sz="4"/>
+              <w:right w:val="single" w:color="BFBFBF" w:sz="4"/>
+            </w:tcBorders>
+            <w:shd w:fill="E8EEF6" w:color="auto" w:val="clear"/>
+            <w:tcMar>
+              <w:top w:type="dxa" w:w="60"/>
+              <w:left w:type="dxa" w:w="100"/>
+              <w:bottom w:type="dxa" w:w="60"/>
+              <w:right w:type="dxa" w:w="100"/>
+            </w:tcMar>
+          </w:tcPr>
+          <w:p>
+            <w:pPr>
+              <w:keepNext/>
+              <w:keepLines/>
+              <w:spacing w:after="0"/>
+              <w:jc w:val="right"/>
+            </w:pPr>
+            <w:r>
+              <w:rPr>
+                <w:b/>
+                <w:bCs/>
+                <w:sz w:val="18"/>
+                <w:szCs w:val="18"/>
+              </w:rPr>
+              <w:t xml:space="preserve">Test trips</w:t>
+            </w:r>
+          </w:p>
+        </w:tc>
+        <w:tc>
+          <w:tcPr>
+            <w:tcW w:type="dxa" w:w="1250"/>
+            <w:tcBorders>
+              <w:top w:val="single" w:color="BFBFBF" w:sz="4"/>
+              <w:left w:val="single" w:color="BFBFBF" w:sz="4"/>
+              <w:bottom w:val="single" w:color="BFBFBF" w:sz="4"/>
+              <w:right w:val="single" w:color="BFBFBF" w:sz="4"/>
+            </w:tcBorders>
+            <w:shd w:fill="E8EEF6" w:color="auto" w:val="clear"/>
+            <w:tcMar>
+              <w:top w:type="dxa" w:w="60"/>
+              <w:left w:type="dxa" w:w="100"/>
+              <w:bottom w:type="dxa" w:w="60"/>
+              <w:right w:type="dxa" w:w="100"/>
+            </w:tcMar>
+          </w:tcPr>
+          <w:p>
+            <w:pPr>
+              <w:keepNext/>
+              <w:keepLines/>
+              <w:spacing w:after="0"/>
+              <w:jc w:val="right"/>
+            </w:pPr>
+            <w:r>
+              <w:rPr>
+                <w:b/>
+                <w:bCs/>
+                <w:sz w:val="18"/>
+                <w:szCs w:val="18"/>
+              </w:rPr>
+              <w:t xml:space="preserve">Correct: Own</w:t>
+            </w:r>
+          </w:p>
+        </w:tc>
+        <w:tc>
+          <w:tcPr>
+            <w:tcW w:type="dxa" w:w="1300"/>
+            <w:tcBorders>
+              <w:top w:val="single" w:color="BFBFBF" w:sz="4"/>
+              <w:left w:val="single" w:color="BFBFBF" w:sz="4"/>
+              <w:bottom w:val="single" w:color="BFBFBF" w:sz="4"/>
+              <w:right w:val="single" w:color="BFBFBF" w:sz="4"/>
+            </w:tcBorders>
+            <w:shd w:fill="E8EEF6" w:color="auto" w:val="clear"/>
+            <w:tcMar>
+              <w:top w:type="dxa" w:w="60"/>
+              <w:left w:type="dxa" w:w="100"/>
+              <w:bottom w:type="dxa" w:w="60"/>
+              <w:right w:type="dxa" w:w="100"/>
+            </w:tcMar>
+          </w:tcPr>
+          <w:p>
+            <w:pPr>
+              <w:keepNext/>
+              <w:keepLines/>
+              <w:spacing w:after="0"/>
+              <w:jc w:val="right"/>
+            </w:pPr>
+            <w:r>
+              <w:rPr>
+                <w:b/>
+                <w:bCs/>
+                <w:sz w:val="18"/>
+                <w:szCs w:val="18"/>
+              </w:rPr>
+              <w:t xml:space="preserve">Correct: Pooled</w:t>
+            </w:r>
+          </w:p>
+        </w:tc>
+        <w:tc>
+          <w:tcPr>
+            <w:tcW w:type="dxa" w:w="1250"/>
+            <w:tcBorders>
+              <w:top w:val="single" w:color="BFBFBF" w:sz="4"/>
+              <w:left w:val="single" w:color="BFBFBF" w:sz="4"/>
+              <w:bottom w:val="single" w:color="BFBFBF" w:sz="4"/>
+              <w:right w:val="single" w:color="BFBFBF" w:sz="4"/>
+            </w:tcBorders>
+            <w:shd w:fill="E8EEF6" w:color="auto" w:val="clear"/>
+            <w:tcMar>
+              <w:top w:type="dxa" w:w="60"/>
+              <w:left w:type="dxa" w:w="100"/>
+              <w:bottom w:type="dxa" w:w="60"/>
+              <w:right w:type="dxa" w:w="100"/>
+            </w:tcMar>
+          </w:tcPr>
+          <w:p>
+            <w:pPr>
+              <w:keepNext/>
+              <w:keepLines/>
+              <w:spacing w:after="0"/>
+              <w:jc w:val="right"/>
+            </w:pPr>
+            <w:r>
+              <w:rPr>
+                <w:b/>
+                <w:bCs/>
+                <w:sz w:val="18"/>
+                <w:szCs w:val="18"/>
+              </w:rPr>
+              <w:t xml:space="preserve">Correct: Blend</w:t>
+            </w:r>
+          </w:p>
+        </w:tc>
+        <w:tc>
+          <w:tcPr>
+            <w:tcW w:type="dxa" w:w="1350"/>
+            <w:tcBorders>
+              <w:top w:val="single" w:color="BFBFBF" w:sz="4"/>
+              <w:left w:val="single" w:color="BFBFBF" w:sz="4"/>
+              <w:bottom w:val="single" w:color="BFBFBF" w:sz="4"/>
+              <w:right w:val="single" w:color="BFBFBF" w:sz="4"/>
+            </w:tcBorders>
+            <w:shd w:fill="E8EEF6" w:color="auto" w:val="clear"/>
+            <w:tcMar>
+              <w:top w:type="dxa" w:w="60"/>
+              <w:left w:type="dxa" w:w="100"/>
+              <w:bottom w:type="dxa" w:w="60"/>
+              <w:right w:type="dxa" w:w="100"/>
+            </w:tcMar>
+          </w:tcPr>
+          <w:p>
+            <w:pPr>
+              <w:keepNext/>
+              <w:keepLines/>
+              <w:spacing w:after="0"/>
+              <w:jc w:val="right"/>
+            </w:pPr>
+            <w:r>
+              <w:rPr>
+                <w:b/>
+                <w:bCs/>
+                <w:sz w:val="18"/>
+                <w:szCs w:val="18"/>
+              </w:rPr>
+              <w:t xml:space="preserve">Validation picks</w:t>
+            </w:r>
+          </w:p>
+        </w:tc>
+        <w:tc>
+          <w:tcPr>
+            <w:tcW w:type="dxa" w:w="1588"/>
+            <w:tcBorders>
+              <w:top w:val="single" w:color="BFBFBF" w:sz="4"/>
+              <w:left w:val="single" w:color="BFBFBF" w:sz="4"/>
+              <w:bottom w:val="single" w:color="BFBFBF" w:sz="4"/>
+              <w:right w:val="single" w:color="BFBFBF" w:sz="4"/>
+            </w:tcBorders>
+            <w:shd w:fill="E8EEF6" w:color="auto" w:val="clear"/>
+            <w:tcMar>
+              <w:top w:type="dxa" w:w="60"/>
+              <w:left w:type="dxa" w:w="100"/>
+              <w:bottom w:type="dxa" w:w="60"/>
+              <w:right w:type="dxa" w:w="100"/>
+            </w:tcMar>
+          </w:tcPr>
+          <w:p>
+            <w:pPr>
+              <w:keepNext/>
+              <w:keepLines/>
+              <w:spacing w:after="0"/>
+              <w:jc w:val="right"/>
+            </w:pPr>
+            <w:r>
+              <w:rPr>
+                <w:b/>
+                <w:bCs/>
+                <w:sz w:val="18"/>
+                <w:szCs w:val="18"/>
+              </w:rPr>
+              <w:t xml:space="preserve">Gain vs pooled-for-all</w:t>
+            </w:r>
+          </w:p>
+        </w:tc>
+      </w:tr>
+      <w:tr>
+        <w:trPr>
+          <w:cantSplit/>
+        </w:trPr>
+        <w:tc>
+          <w:tcPr>
+            <w:tcW w:type="dxa" w:w="1800"/>
+            <w:tcBorders>
+              <w:top w:val="single" w:color="BFBFBF" w:sz="4"/>
+              <w:left w:val="single" w:color="BFBFBF" w:sz="4"/>
+              <w:bottom w:val="single" w:color="BFBFBF" w:sz="4"/>
+              <w:right w:val="single" w:color="BFBFBF" w:sz="4"/>
+            </w:tcBorders>
+            <w:tcMar>
+              <w:top w:type="dxa" w:w="60"/>
+              <w:left w:type="dxa" w:w="100"/>
+              <w:bottom w:type="dxa" w:w="60"/>
+              <w:right w:type="dxa" w:w="100"/>
+            </w:tcMar>
+          </w:tcPr>
+          <w:p>
+            <w:pPr>
+              <w:keepNext/>
+              <w:keepLines/>
+              <w:spacing w:after="0"/>
+              <w:jc w:val="left"/>
+            </w:pPr>
+            <w:r>
+              <w:rPr>
+                <w:sz w:val="18"/>
+                <w:szCs w:val="18"/>
+              </w:rPr>
+              <w:t xml:space="preserve">Gondal</w:t>
+            </w:r>
+          </w:p>
+        </w:tc>
+        <w:tc>
+          <w:tcPr>
+            <w:tcW w:type="dxa" w:w="1100"/>
+            <w:tcBorders>
+              <w:top w:val="single" w:color="BFBFBF" w:sz="4"/>
+              <w:left w:val="single" w:color="BFBFBF" w:sz="4"/>
+              <w:bottom w:val="single" w:color="BFBFBF" w:sz="4"/>
+              <w:right w:val="single" w:color="BFBFBF" w:sz="4"/>
+            </w:tcBorders>
+            <w:tcMar>
+              <w:top w:type="dxa" w:w="60"/>
+              <w:left w:type="dxa" w:w="100"/>
+              <w:bottom w:type="dxa" w:w="60"/>
+              <w:right w:type="dxa" w:w="100"/>
+            </w:tcMar>
+          </w:tcPr>
+          <w:p>
+            <w:pPr>
+              <w:keepNext/>
+              <w:keepLines/>
+              <w:spacing w:after="0"/>
+              <w:jc w:val="right"/>
+            </w:pPr>
+            <w:r>
+              <w:rPr>
+                <w:sz w:val="18"/>
+                <w:szCs w:val="18"/>
+              </w:rPr>
+              <w:t xml:space="preserve">32,630</w:t>
+            </w:r>
+          </w:p>
+        </w:tc>
+        <w:tc>
+          <w:tcPr>
+            <w:tcW w:type="dxa" w:w="1250"/>
+            <w:tcBorders>
+              <w:top w:val="single" w:color="BFBFBF" w:sz="4"/>
+              <w:left w:val="single" w:color="BFBFBF" w:sz="4"/>
+              <w:bottom w:val="single" w:color="BFBFBF" w:sz="4"/>
+              <w:right w:val="single" w:color="BFBFBF" w:sz="4"/>
+            </w:tcBorders>
+            <w:tcMar>
+              <w:top w:type="dxa" w:w="60"/>
+              <w:left w:type="dxa" w:w="100"/>
+              <w:bottom w:type="dxa" w:w="60"/>
+              <w:right w:type="dxa" w:w="100"/>
+            </w:tcMar>
+          </w:tcPr>
+          <w:p>
+            <w:pPr>
+              <w:keepNext/>
+              <w:keepLines/>
+              <w:spacing w:after="0"/>
+              <w:jc w:val="right"/>
+            </w:pPr>
+            <w:r>
+              <w:rPr>
+                <w:sz w:val="18"/>
+                <w:szCs w:val="18"/>
+              </w:rPr>
+              <w:t xml:space="preserve">12,910</w:t>
+            </w:r>
+          </w:p>
+        </w:tc>
+        <w:tc>
+          <w:tcPr>
+            <w:tcW w:type="dxa" w:w="1300"/>
+            <w:tcBorders>
+              <w:top w:val="single" w:color="BFBFBF" w:sz="4"/>
+              <w:left w:val="single" w:color="BFBFBF" w:sz="4"/>
+              <w:bottom w:val="single" w:color="BFBFBF" w:sz="4"/>
+              <w:right w:val="single" w:color="BFBFBF" w:sz="4"/>
+            </w:tcBorders>
+            <w:tcMar>
+              <w:top w:type="dxa" w:w="60"/>
+              <w:left w:type="dxa" w:w="100"/>
+              <w:bottom w:type="dxa" w:w="60"/>
+              <w:right w:type="dxa" w:w="100"/>
+            </w:tcMar>
+          </w:tcPr>
+          <w:p>
+            <w:pPr>
+              <w:keepNext/>
+              <w:keepLines/>
+              <w:spacing w:after="0"/>
+              <w:jc w:val="right"/>
+            </w:pPr>
+            <w:r>
+              <w:rPr>
+                <w:sz w:val="18"/>
+                <w:szCs w:val="18"/>
+              </w:rPr>
+              <w:t xml:space="preserve">13,156</w:t>
+            </w:r>
+          </w:p>
+        </w:tc>
+        <w:tc>
+          <w:tcPr>
+            <w:tcW w:type="dxa" w:w="1250"/>
+            <w:tcBorders>
+              <w:top w:val="single" w:color="BFBFBF" w:sz="4"/>
+              <w:left w:val="single" w:color="BFBFBF" w:sz="4"/>
+              <w:bottom w:val="single" w:color="BFBFBF" w:sz="4"/>
+              <w:right w:val="single" w:color="BFBFBF" w:sz="4"/>
+            </w:tcBorders>
+            <w:tcMar>
+              <w:top w:type="dxa" w:w="60"/>
+              <w:left w:type="dxa" w:w="100"/>
+              <w:bottom w:type="dxa" w:w="60"/>
+              <w:right w:type="dxa" w:w="100"/>
+            </w:tcMar>
+          </w:tcPr>
+          <w:p>
+            <w:pPr>
+              <w:keepNext/>
+              <w:keepLines/>
+              <w:spacing w:after="0"/>
+              <w:jc w:val="right"/>
+            </w:pPr>
+            <w:r>
+              <w:rPr>
+                <w:sz w:val="18"/>
+                <w:szCs w:val="18"/>
+              </w:rPr>
+              <w:t xml:space="preserve">13,130</w:t>
+            </w:r>
+          </w:p>
+        </w:tc>
+        <w:tc>
+          <w:tcPr>
+            <w:tcW w:type="dxa" w:w="1350"/>
+            <w:tcBorders>
+              <w:top w:val="single" w:color="BFBFBF" w:sz="4"/>
+              <w:left w:val="single" w:color="BFBFBF" w:sz="4"/>
+              <w:bottom w:val="single" w:color="BFBFBF" w:sz="4"/>
+              <w:right w:val="single" w:color="BFBFBF" w:sz="4"/>
+            </w:tcBorders>
+            <w:tcMar>
+              <w:top w:type="dxa" w:w="60"/>
+              <w:left w:type="dxa" w:w="100"/>
+              <w:bottom w:type="dxa" w:w="60"/>
+              <w:right w:type="dxa" w:w="100"/>
+            </w:tcMar>
+          </w:tcPr>
+          <w:p>
+            <w:pPr>
+              <w:keepNext/>
+              <w:keepLines/>
+              <w:spacing w:after="0"/>
+              <w:jc w:val="right"/>
+            </w:pPr>
+            <w:r>
+              <w:rPr>
+                <w:sz w:val="18"/>
+                <w:szCs w:val="18"/>
+              </w:rPr>
+              <w:t xml:space="preserve">Pooled</w:t>
+            </w:r>
+          </w:p>
+        </w:tc>
+        <w:tc>
+          <w:tcPr>
+            <w:tcW w:type="dxa" w:w="1588"/>
+            <w:tcBorders>
+              <w:top w:val="single" w:color="BFBFBF" w:sz="4"/>
+              <w:left w:val="single" w:color="BFBFBF" w:sz="4"/>
+              <w:bottom w:val="single" w:color="BFBFBF" w:sz="4"/>
+              <w:right w:val="single" w:color="BFBFBF" w:sz="4"/>
+            </w:tcBorders>
+            <w:tcMar>
+              <w:top w:type="dxa" w:w="60"/>
+              <w:left w:type="dxa" w:w="100"/>
+              <w:bottom w:type="dxa" w:w="60"/>
+              <w:right w:type="dxa" w:w="100"/>
+            </w:tcMar>
+          </w:tcPr>
+          <w:p>
+            <w:pPr>
+              <w:keepNext/>
+              <w:keepLines/>
+              <w:spacing w:after="0"/>
+              <w:jc w:val="right"/>
+            </w:pPr>
+            <w:r>
+              <w:rPr>
+                <w:sz w:val="18"/>
+                <w:szCs w:val="18"/>
+              </w:rPr>
+              <w:t xml:space="preserve">0</w:t>
+            </w:r>
+          </w:p>
+        </w:tc>
+      </w:tr>
+      <w:tr>
+        <w:trPr>
+          <w:cantSplit/>
+        </w:trPr>
+        <w:tc>
+          <w:tcPr>
+            <w:tcW w:type="dxa" w:w="1800"/>
+            <w:tcBorders>
+              <w:top w:val="single" w:color="BFBFBF" w:sz="4"/>
+              <w:left w:val="single" w:color="BFBFBF" w:sz="4"/>
+              <w:bottom w:val="single" w:color="BFBFBF" w:sz="4"/>
+              <w:right w:val="single" w:color="BFBFBF" w:sz="4"/>
+            </w:tcBorders>
+            <w:tcMar>
+              <w:top w:type="dxa" w:w="60"/>
+              <w:left w:type="dxa" w:w="100"/>
+              <w:bottom w:type="dxa" w:w="60"/>
+              <w:right w:type="dxa" w:w="100"/>
+            </w:tcMar>
+          </w:tcPr>
+          <w:p>
+            <w:pPr>
+              <w:keepNext/>
+              <w:keepLines/>
+              <w:spacing w:after="0"/>
+              <w:jc w:val="left"/>
+            </w:pPr>
+            <w:r>
+              <w:rPr>
+                <w:sz w:val="18"/>
+                <w:szCs w:val="18"/>
+              </w:rPr>
+              <w:t xml:space="preserve">The Devilfire Empire</w:t>
+            </w:r>
+          </w:p>
+        </w:tc>
+        <w:tc>
+          <w:tcPr>
+            <w:tcW w:type="dxa" w:w="1100"/>
+            <w:tcBorders>
+              <w:top w:val="single" w:color="BFBFBF" w:sz="4"/>
+              <w:left w:val="single" w:color="BFBFBF" w:sz="4"/>
+              <w:bottom w:val="single" w:color="BFBFBF" w:sz="4"/>
+              <w:right w:val="single" w:color="BFBFBF" w:sz="4"/>
+            </w:tcBorders>
+            <w:tcMar>
+              <w:top w:type="dxa" w:w="60"/>
+              <w:left w:type="dxa" w:w="100"/>
+              <w:bottom w:type="dxa" w:w="60"/>
+              <w:right w:type="dxa" w:w="100"/>
+            </w:tcMar>
+          </w:tcPr>
+          <w:p>
+            <w:pPr>
+              <w:keepNext/>
+              <w:keepLines/>
+              <w:spacing w:after="0"/>
+              <w:jc w:val="right"/>
+            </w:pPr>
+            <w:r>
+              <w:rPr>
+                <w:sz w:val="18"/>
+                <w:szCs w:val="18"/>
+              </w:rPr>
+              <w:t xml:space="preserve">16,882</w:t>
+            </w:r>
+          </w:p>
+        </w:tc>
+        <w:tc>
+          <w:tcPr>
+            <w:tcW w:type="dxa" w:w="1250"/>
+            <w:tcBorders>
+              <w:top w:val="single" w:color="BFBFBF" w:sz="4"/>
+              <w:left w:val="single" w:color="BFBFBF" w:sz="4"/>
+              <w:bottom w:val="single" w:color="BFBFBF" w:sz="4"/>
+              <w:right w:val="single" w:color="BFBFBF" w:sz="4"/>
+            </w:tcBorders>
+            <w:tcMar>
+              <w:top w:type="dxa" w:w="60"/>
+              <w:left w:type="dxa" w:w="100"/>
+              <w:bottom w:type="dxa" w:w="60"/>
+              <w:right w:type="dxa" w:w="100"/>
+            </w:tcMar>
+          </w:tcPr>
+          <w:p>
+            <w:pPr>
+              <w:keepNext/>
+              <w:keepLines/>
+              <w:spacing w:after="0"/>
+              <w:jc w:val="right"/>
+            </w:pPr>
+            <w:r>
+              <w:rPr>
+                <w:sz w:val="18"/>
+                <w:szCs w:val="18"/>
+              </w:rPr>
+              <w:t xml:space="preserve">10,596</w:t>
+            </w:r>
+          </w:p>
+        </w:tc>
+        <w:tc>
+          <w:tcPr>
+            <w:tcW w:type="dxa" w:w="1300"/>
+            <w:tcBorders>
+              <w:top w:val="single" w:color="BFBFBF" w:sz="4"/>
+              <w:left w:val="single" w:color="BFBFBF" w:sz="4"/>
+              <w:bottom w:val="single" w:color="BFBFBF" w:sz="4"/>
+              <w:right w:val="single" w:color="BFBFBF" w:sz="4"/>
+            </w:tcBorders>
+            <w:tcMar>
+              <w:top w:type="dxa" w:w="60"/>
+              <w:left w:type="dxa" w:w="100"/>
+              <w:bottom w:type="dxa" w:w="60"/>
+              <w:right w:type="dxa" w:w="100"/>
+            </w:tcMar>
+          </w:tcPr>
+          <w:p>
+            <w:pPr>
+              <w:keepNext/>
+              <w:keepLines/>
+              <w:spacing w:after="0"/>
+              <w:jc w:val="right"/>
+            </w:pPr>
+            <w:r>
+              <w:rPr>
+                <w:sz w:val="18"/>
+                <w:szCs w:val="18"/>
+              </w:rPr>
+              <w:t xml:space="preserve">10,190</w:t>
+            </w:r>
+          </w:p>
+        </w:tc>
+        <w:tc>
+          <w:tcPr>
+            <w:tcW w:type="dxa" w:w="1250"/>
+            <w:tcBorders>
+              <w:top w:val="single" w:color="BFBFBF" w:sz="4"/>
+              <w:left w:val="single" w:color="BFBFBF" w:sz="4"/>
+              <w:bottom w:val="single" w:color="BFBFBF" w:sz="4"/>
+              <w:right w:val="single" w:color="BFBFBF" w:sz="4"/>
+            </w:tcBorders>
+            <w:tcMar>
+              <w:top w:type="dxa" w:w="60"/>
+              <w:left w:type="dxa" w:w="100"/>
+              <w:bottom w:type="dxa" w:w="60"/>
+              <w:right w:type="dxa" w:w="100"/>
+            </w:tcMar>
+          </w:tcPr>
+          <w:p>
+            <w:pPr>
+              <w:keepNext/>
+              <w:keepLines/>
+              <w:spacing w:after="0"/>
+              <w:jc w:val="right"/>
+            </w:pPr>
+            <w:r>
+              <w:rPr>
+                <w:sz w:val="18"/>
+                <w:szCs w:val="18"/>
+              </w:rPr>
+              <w:t xml:space="preserve">10,589</w:t>
+            </w:r>
+          </w:p>
+        </w:tc>
+        <w:tc>
+          <w:tcPr>
+            <w:tcW w:type="dxa" w:w="1350"/>
+            <w:tcBorders>
+              <w:top w:val="single" w:color="BFBFBF" w:sz="4"/>
+              <w:left w:val="single" w:color="BFBFBF" w:sz="4"/>
+              <w:bottom w:val="single" w:color="BFBFBF" w:sz="4"/>
+              <w:right w:val="single" w:color="BFBFBF" w:sz="4"/>
+            </w:tcBorders>
+            <w:tcMar>
+              <w:top w:type="dxa" w:w="60"/>
+              <w:left w:type="dxa" w:w="100"/>
+              <w:bottom w:type="dxa" w:w="60"/>
+              <w:right w:type="dxa" w:w="100"/>
+            </w:tcMar>
+          </w:tcPr>
+          <w:p>
+            <w:pPr>
+              <w:keepNext/>
+              <w:keepLines/>
+              <w:spacing w:after="0"/>
+              <w:jc w:val="right"/>
+            </w:pPr>
+            <w:r>
+              <w:rPr>
+                <w:sz w:val="18"/>
+                <w:szCs w:val="18"/>
+              </w:rPr>
+              <w:t xml:space="preserve">Own</w:t>
+            </w:r>
+          </w:p>
+        </w:tc>
+        <w:tc>
+          <w:tcPr>
+            <w:tcW w:type="dxa" w:w="1588"/>
+            <w:tcBorders>
+              <w:top w:val="single" w:color="BFBFBF" w:sz="4"/>
+              <w:left w:val="single" w:color="BFBFBF" w:sz="4"/>
+              <w:bottom w:val="single" w:color="BFBFBF" w:sz="4"/>
+              <w:right w:val="single" w:color="BFBFBF" w:sz="4"/>
+            </w:tcBorders>
+            <w:tcMar>
+              <w:top w:type="dxa" w:w="60"/>
+              <w:left w:type="dxa" w:w="100"/>
+              <w:bottom w:type="dxa" w:w="60"/>
+              <w:right w:type="dxa" w:w="100"/>
+            </w:tcMar>
+          </w:tcPr>
+          <w:p>
+            <w:pPr>
+              <w:keepNext/>
+              <w:keepLines/>
+              <w:spacing w:after="0"/>
+              <w:jc w:val="right"/>
+            </w:pPr>
+            <w:r>
+              <w:rPr>
+                <w:sz w:val="18"/>
+                <w:szCs w:val="18"/>
+              </w:rPr>
+              <w:t xml:space="preserve">+406</w:t>
+            </w:r>
+          </w:p>
+        </w:tc>
+      </w:tr>
+      <w:tr>
+        <w:trPr>
+          <w:cantSplit/>
+        </w:trPr>
+        <w:tc>
+          <w:tcPr>
+            <w:tcW w:type="dxa" w:w="1800"/>
+            <w:tcBorders>
+              <w:top w:val="single" w:color="BFBFBF" w:sz="4"/>
+              <w:left w:val="single" w:color="BFBFBF" w:sz="4"/>
+              <w:bottom w:val="single" w:color="BFBFBF" w:sz="4"/>
+              <w:right w:val="single" w:color="BFBFBF" w:sz="4"/>
+            </w:tcBorders>
+            <w:tcMar>
+              <w:top w:type="dxa" w:w="60"/>
+              <w:left w:type="dxa" w:w="100"/>
+              <w:bottom w:type="dxa" w:w="60"/>
+              <w:right w:type="dxa" w:w="100"/>
+            </w:tcMar>
+          </w:tcPr>
+          <w:p>
+            <w:pPr>
+              <w:keepNext/>
+              <w:keepLines/>
+              <w:spacing w:after="0"/>
+              <w:jc w:val="left"/>
+            </w:pPr>
+            <w:r>
+              <w:rPr>
+                <w:sz w:val="18"/>
+                <w:szCs w:val="18"/>
+              </w:rPr>
+              <w:t xml:space="preserve">Elbonia</w:t>
+            </w:r>
+          </w:p>
+        </w:tc>
+        <w:tc>
+          <w:tcPr>
+            <w:tcW w:type="dxa" w:w="1100"/>
+            <w:tcBorders>
+              <w:top w:val="single" w:color="BFBFBF" w:sz="4"/>
+              <w:left w:val="single" w:color="BFBFBF" w:sz="4"/>
+              <w:bottom w:val="single" w:color="BFBFBF" w:sz="4"/>
+              <w:right w:val="single" w:color="BFBFBF" w:sz="4"/>
+            </w:tcBorders>
+            <w:tcMar>
+              <w:top w:type="dxa" w:w="60"/>
+              <w:left w:type="dxa" w:w="100"/>
+              <w:bottom w:type="dxa" w:w="60"/>
+              <w:right w:type="dxa" w:w="100"/>
+            </w:tcMar>
+          </w:tcPr>
+          <w:p>
+            <w:pPr>
+              <w:keepNext/>
+              <w:keepLines/>
+              <w:spacing w:after="0"/>
+              <w:jc w:val="right"/>
+            </w:pPr>
+            <w:r>
+              <w:rPr>
+                <w:sz w:val="18"/>
+                <w:szCs w:val="18"/>
+              </w:rPr>
+              <w:t xml:space="preserve">13,843</w:t>
+            </w:r>
+          </w:p>
+        </w:tc>
+        <w:tc>
+          <w:tcPr>
+            <w:tcW w:type="dxa" w:w="1250"/>
+            <w:tcBorders>
+              <w:top w:val="single" w:color="BFBFBF" w:sz="4"/>
+              <w:left w:val="single" w:color="BFBFBF" w:sz="4"/>
+              <w:bottom w:val="single" w:color="BFBFBF" w:sz="4"/>
+              <w:right w:val="single" w:color="BFBFBF" w:sz="4"/>
+            </w:tcBorders>
+            <w:tcMar>
+              <w:top w:type="dxa" w:w="60"/>
+              <w:left w:type="dxa" w:w="100"/>
+              <w:bottom w:type="dxa" w:w="60"/>
+              <w:right w:type="dxa" w:w="100"/>
+            </w:tcMar>
+          </w:tcPr>
+          <w:p>
+            <w:pPr>
+              <w:keepNext/>
+              <w:keepLines/>
+              <w:spacing w:after="0"/>
+              <w:jc w:val="right"/>
+            </w:pPr>
+            <w:r>
+              <w:rPr>
+                <w:sz w:val="18"/>
+                <w:szCs w:val="18"/>
+              </w:rPr>
+              <w:t xml:space="preserve">4,860</w:t>
+            </w:r>
+          </w:p>
+        </w:tc>
+        <w:tc>
+          <w:tcPr>
+            <w:tcW w:type="dxa" w:w="1300"/>
+            <w:tcBorders>
+              <w:top w:val="single" w:color="BFBFBF" w:sz="4"/>
+              <w:left w:val="single" w:color="BFBFBF" w:sz="4"/>
+              <w:bottom w:val="single" w:color="BFBFBF" w:sz="4"/>
+              <w:right w:val="single" w:color="BFBFBF" w:sz="4"/>
+            </w:tcBorders>
+            <w:tcMar>
+              <w:top w:type="dxa" w:w="60"/>
+              <w:left w:type="dxa" w:w="100"/>
+              <w:bottom w:type="dxa" w:w="60"/>
+              <w:right w:type="dxa" w:w="100"/>
+            </w:tcMar>
+          </w:tcPr>
+          <w:p>
+            <w:pPr>
+              <w:keepNext/>
+              <w:keepLines/>
+              <w:spacing w:after="0"/>
+              <w:jc w:val="right"/>
+            </w:pPr>
+            <w:r>
+              <w:rPr>
+                <w:sz w:val="18"/>
+                <w:szCs w:val="18"/>
+              </w:rPr>
+              <w:t xml:space="preserve">5,146</w:t>
+            </w:r>
+          </w:p>
+        </w:tc>
+        <w:tc>
+          <w:tcPr>
+            <w:tcW w:type="dxa" w:w="1250"/>
+            <w:tcBorders>
+              <w:top w:val="single" w:color="BFBFBF" w:sz="4"/>
+              <w:left w:val="single" w:color="BFBFBF" w:sz="4"/>
+              <w:bottom w:val="single" w:color="BFBFBF" w:sz="4"/>
+              <w:right w:val="single" w:color="BFBFBF" w:sz="4"/>
+            </w:tcBorders>
+            <w:tcMar>
+              <w:top w:type="dxa" w:w="60"/>
+              <w:left w:type="dxa" w:w="100"/>
+              <w:bottom w:type="dxa" w:w="60"/>
+              <w:right w:type="dxa" w:w="100"/>
+            </w:tcMar>
+          </w:tcPr>
+          <w:p>
+            <w:pPr>
+              <w:keepNext/>
+              <w:keepLines/>
+              <w:spacing w:after="0"/>
+              <w:jc w:val="right"/>
+            </w:pPr>
+            <w:r>
+              <w:rPr>
+                <w:sz w:val="18"/>
+                <w:szCs w:val="18"/>
+              </w:rPr>
+              <w:t xml:space="preserve">5,166</w:t>
+            </w:r>
+          </w:p>
+        </w:tc>
+        <w:tc>
+          <w:tcPr>
+            <w:tcW w:type="dxa" w:w="1350"/>
+            <w:tcBorders>
+              <w:top w:val="single" w:color="BFBFBF" w:sz="4"/>
+              <w:left w:val="single" w:color="BFBFBF" w:sz="4"/>
+              <w:bottom w:val="single" w:color="BFBFBF" w:sz="4"/>
+              <w:right w:val="single" w:color="BFBFBF" w:sz="4"/>
+            </w:tcBorders>
+            <w:tcMar>
+              <w:top w:type="dxa" w:w="60"/>
+              <w:left w:type="dxa" w:w="100"/>
+              <w:bottom w:type="dxa" w:w="60"/>
+              <w:right w:type="dxa" w:w="100"/>
+            </w:tcMar>
+          </w:tcPr>
+          <w:p>
+            <w:pPr>
+              <w:keepNext/>
+              <w:keepLines/>
+              <w:spacing w:after="0"/>
+              <w:jc w:val="right"/>
+            </w:pPr>
+            <w:r>
+              <w:rPr>
+                <w:sz w:val="18"/>
+                <w:szCs w:val="18"/>
+              </w:rPr>
+              <w:t xml:space="preserve">Pooled</w:t>
+            </w:r>
+          </w:p>
+        </w:tc>
+        <w:tc>
+          <w:tcPr>
+            <w:tcW w:type="dxa" w:w="1588"/>
+            <w:tcBorders>
+              <w:top w:val="single" w:color="BFBFBF" w:sz="4"/>
+              <w:left w:val="single" w:color="BFBFBF" w:sz="4"/>
+              <w:bottom w:val="single" w:color="BFBFBF" w:sz="4"/>
+              <w:right w:val="single" w:color="BFBFBF" w:sz="4"/>
+            </w:tcBorders>
+            <w:tcMar>
+              <w:top w:type="dxa" w:w="60"/>
+              <w:left w:type="dxa" w:w="100"/>
+              <w:bottom w:type="dxa" w:w="60"/>
+              <w:right w:type="dxa" w:w="100"/>
+            </w:tcMar>
+          </w:tcPr>
+          <w:p>
+            <w:pPr>
+              <w:keepNext/>
+              <w:keepLines/>
+              <w:spacing w:after="0"/>
+              <w:jc w:val="right"/>
+            </w:pPr>
+            <w:r>
+              <w:rPr>
+                <w:sz w:val="18"/>
+                <w:szCs w:val="18"/>
+              </w:rPr>
+              <w:t xml:space="preserve">0</w:t>
+            </w:r>
+          </w:p>
+        </w:tc>
+      </w:tr>
+      <w:tr>
+        <w:trPr>
+          <w:cantSplit/>
+        </w:trPr>
+        <w:tc>
+          <w:tcPr>
+            <w:tcW w:type="dxa" w:w="1800"/>
+            <w:tcBorders>
+              <w:top w:val="single" w:color="BFBFBF" w:sz="4"/>
+              <w:left w:val="single" w:color="BFBFBF" w:sz="4"/>
+              <w:bottom w:val="single" w:color="BFBFBF" w:sz="4"/>
+              <w:right w:val="single" w:color="BFBFBF" w:sz="4"/>
+            </w:tcBorders>
+            <w:tcMar>
+              <w:top w:type="dxa" w:w="60"/>
+              <w:left w:type="dxa" w:w="100"/>
+              <w:bottom w:type="dxa" w:w="60"/>
+              <w:right w:type="dxa" w:w="100"/>
+            </w:tcMar>
+          </w:tcPr>
+          <w:p>
+            <w:pPr>
+              <w:keepNext/>
+              <w:keepLines/>
+              <w:spacing w:after="0"/>
+              <w:jc w:val="left"/>
+            </w:pPr>
+            <w:r>
+              <w:rPr>
+                <w:sz w:val="18"/>
+                <w:szCs w:val="18"/>
+              </w:rPr>
+              <w:t xml:space="preserve">Tcherkistan</w:t>
+            </w:r>
+          </w:p>
+        </w:tc>
+        <w:tc>
+          <w:tcPr>
+            <w:tcW w:type="dxa" w:w="1100"/>
+            <w:tcBorders>
+              <w:top w:val="single" w:color="BFBFBF" w:sz="4"/>
+              <w:left w:val="single" w:color="BFBFBF" w:sz="4"/>
+              <w:bottom w:val="single" w:color="BFBFBF" w:sz="4"/>
+              <w:right w:val="single" w:color="BFBFBF" w:sz="4"/>
+            </w:tcBorders>
+            <w:tcMar>
+              <w:top w:type="dxa" w:w="60"/>
+              <w:left w:type="dxa" w:w="100"/>
+              <w:bottom w:type="dxa" w:w="60"/>
+              <w:right w:type="dxa" w:w="100"/>
+            </w:tcMar>
+          </w:tcPr>
+          <w:p>
+            <w:pPr>
+              <w:keepNext/>
+              <w:keepLines/>
+              <w:spacing w:after="0"/>
+              <w:jc w:val="right"/>
+            </w:pPr>
+            <w:r>
+              <w:rPr>
+                <w:sz w:val="18"/>
+                <w:szCs w:val="18"/>
+              </w:rPr>
+              <w:t xml:space="preserve">5,459</w:t>
+            </w:r>
+          </w:p>
+        </w:tc>
+        <w:tc>
+          <w:tcPr>
+            <w:tcW w:type="dxa" w:w="1250"/>
+            <w:tcBorders>
+              <w:top w:val="single" w:color="BFBFBF" w:sz="4"/>
+              <w:left w:val="single" w:color="BFBFBF" w:sz="4"/>
+              <w:bottom w:val="single" w:color="BFBFBF" w:sz="4"/>
+              <w:right w:val="single" w:color="BFBFBF" w:sz="4"/>
+            </w:tcBorders>
+            <w:tcMar>
+              <w:top w:type="dxa" w:w="60"/>
+              <w:left w:type="dxa" w:w="100"/>
+              <w:bottom w:type="dxa" w:w="60"/>
+              <w:right w:type="dxa" w:w="100"/>
+            </w:tcMar>
+          </w:tcPr>
+          <w:p>
+            <w:pPr>
+              <w:keepNext/>
+              <w:keepLines/>
+              <w:spacing w:after="0"/>
+              <w:jc w:val="right"/>
+            </w:pPr>
+            <w:r>
+              <w:rPr>
+                <w:sz w:val="18"/>
+                <w:szCs w:val="18"/>
+              </w:rPr>
+              <w:t xml:space="preserve">3,676</w:t>
+            </w:r>
+          </w:p>
+        </w:tc>
+        <w:tc>
+          <w:tcPr>
+            <w:tcW w:type="dxa" w:w="1300"/>
+            <w:tcBorders>
+              <w:top w:val="single" w:color="BFBFBF" w:sz="4"/>
+              <w:left w:val="single" w:color="BFBFBF" w:sz="4"/>
+              <w:bottom w:val="single" w:color="BFBFBF" w:sz="4"/>
+              <w:right w:val="single" w:color="BFBFBF" w:sz="4"/>
+            </w:tcBorders>
+            <w:tcMar>
+              <w:top w:type="dxa" w:w="60"/>
+              <w:left w:type="dxa" w:w="100"/>
+              <w:bottom w:type="dxa" w:w="60"/>
+              <w:right w:type="dxa" w:w="100"/>
+            </w:tcMar>
+          </w:tcPr>
+          <w:p>
+            <w:pPr>
+              <w:keepNext/>
+              <w:keepLines/>
+              <w:spacing w:after="0"/>
+              <w:jc w:val="right"/>
+            </w:pPr>
+            <w:r>
+              <w:rPr>
+                <w:sz w:val="18"/>
+                <w:szCs w:val="18"/>
+              </w:rPr>
+              <w:t xml:space="preserve">3,504</w:t>
+            </w:r>
+          </w:p>
+        </w:tc>
+        <w:tc>
+          <w:tcPr>
+            <w:tcW w:type="dxa" w:w="1250"/>
+            <w:tcBorders>
+              <w:top w:val="single" w:color="BFBFBF" w:sz="4"/>
+              <w:left w:val="single" w:color="BFBFBF" w:sz="4"/>
+              <w:bottom w:val="single" w:color="BFBFBF" w:sz="4"/>
+              <w:right w:val="single" w:color="BFBFBF" w:sz="4"/>
+            </w:tcBorders>
+            <w:tcMar>
+              <w:top w:type="dxa" w:w="60"/>
+              <w:left w:type="dxa" w:w="100"/>
+              <w:bottom w:type="dxa" w:w="60"/>
+              <w:right w:type="dxa" w:w="100"/>
+            </w:tcMar>
+          </w:tcPr>
+          <w:p>
+            <w:pPr>
+              <w:keepNext/>
+              <w:keepLines/>
+              <w:spacing w:after="0"/>
+              <w:jc w:val="right"/>
+            </w:pPr>
+            <w:r>
+              <w:rPr>
+                <w:sz w:val="18"/>
+                <w:szCs w:val="18"/>
+              </w:rPr>
+              <w:t xml:space="preserve">3,666</w:t>
+            </w:r>
+          </w:p>
+        </w:tc>
+        <w:tc>
+          <w:tcPr>
+            <w:tcW w:type="dxa" w:w="1350"/>
+            <w:tcBorders>
+              <w:top w:val="single" w:color="BFBFBF" w:sz="4"/>
+              <w:left w:val="single" w:color="BFBFBF" w:sz="4"/>
+              <w:bottom w:val="single" w:color="BFBFBF" w:sz="4"/>
+              <w:right w:val="single" w:color="BFBFBF" w:sz="4"/>
+            </w:tcBorders>
+            <w:tcMar>
+              <w:top w:type="dxa" w:w="60"/>
+              <w:left w:type="dxa" w:w="100"/>
+              <w:bottom w:type="dxa" w:w="60"/>
+              <w:right w:type="dxa" w:w="100"/>
+            </w:tcMar>
+          </w:tcPr>
+          <w:p>
+            <w:pPr>
+              <w:keepNext/>
+              <w:keepLines/>
+              <w:spacing w:after="0"/>
+              <w:jc w:val="right"/>
+            </w:pPr>
+            <w:r>
+              <w:rPr>
+                <w:sz w:val="18"/>
+                <w:szCs w:val="18"/>
+              </w:rPr>
+              <w:t xml:space="preserve">Own</w:t>
+            </w:r>
+          </w:p>
+        </w:tc>
+        <w:tc>
+          <w:tcPr>
+            <w:tcW w:type="dxa" w:w="1588"/>
+            <w:tcBorders>
+              <w:top w:val="single" w:color="BFBFBF" w:sz="4"/>
+              <w:left w:val="single" w:color="BFBFBF" w:sz="4"/>
+              <w:bottom w:val="single" w:color="BFBFBF" w:sz="4"/>
+              <w:right w:val="single" w:color="BFBFBF" w:sz="4"/>
+            </w:tcBorders>
+            <w:tcMar>
+              <w:top w:type="dxa" w:w="60"/>
+              <w:left w:type="dxa" w:w="100"/>
+              <w:bottom w:type="dxa" w:w="60"/>
+              <w:right w:type="dxa" w:w="100"/>
+            </w:tcMar>
+          </w:tcPr>
+          <w:p>
+            <w:pPr>
+              <w:keepNext/>
+              <w:keepLines/>
+              <w:spacing w:after="0"/>
+              <w:jc w:val="right"/>
+            </w:pPr>
+            <w:r>
+              <w:rPr>
+                <w:sz w:val="18"/>
+                <w:szCs w:val="18"/>
+              </w:rPr>
+              <w:t xml:space="preserve">+172</w:t>
+            </w:r>
+          </w:p>
+        </w:tc>
+      </w:tr>
+      <w:tr>
+        <w:trPr>
+          <w:cantSplit/>
+        </w:trPr>
+        <w:tc>
+          <w:tcPr>
+            <w:tcW w:type="dxa" w:w="1800"/>
+            <w:tcBorders>
+              <w:top w:val="single" w:color="BFBFBF" w:sz="4"/>
+              <w:left w:val="single" w:color="BFBFBF" w:sz="4"/>
+              <w:bottom w:val="single" w:color="BFBFBF" w:sz="4"/>
+              <w:right w:val="single" w:color="BFBFBF" w:sz="4"/>
+            </w:tcBorders>
+            <w:tcMar>
+              <w:top w:type="dxa" w:w="60"/>
+              <w:left w:type="dxa" w:w="100"/>
+              <w:bottom w:type="dxa" w:w="60"/>
+              <w:right w:type="dxa" w:w="100"/>
+            </w:tcMar>
+          </w:tcPr>
+          <w:p>
+            <w:pPr>
+              <w:keepNext/>
+              <w:keepLines/>
+              <w:spacing w:after="0"/>
+              <w:jc w:val="left"/>
+            </w:pPr>
+            <w:r>
+              <w:rPr>
+                <w:sz w:val="18"/>
+                <w:szCs w:val="18"/>
+              </w:rPr>
+              <w:t xml:space="preserve">Bartovia</w:t>
+            </w:r>
+          </w:p>
+        </w:tc>
+        <w:tc>
+          <w:tcPr>
+            <w:tcW w:type="dxa" w:w="1100"/>
+            <w:tcBorders>
+              <w:top w:val="single" w:color="BFBFBF" w:sz="4"/>
+              <w:left w:val="single" w:color="BFBFBF" w:sz="4"/>
+              <w:bottom w:val="single" w:color="BFBFBF" w:sz="4"/>
+              <w:right w:val="single" w:color="BFBFBF" w:sz="4"/>
+            </w:tcBorders>
+            <w:tcMar>
+              <w:top w:type="dxa" w:w="60"/>
+              <w:left w:type="dxa" w:w="100"/>
+              <w:bottom w:type="dxa" w:w="60"/>
+              <w:right w:type="dxa" w:w="100"/>
+            </w:tcMar>
+          </w:tcPr>
+          <w:p>
+            <w:pPr>
+              <w:keepNext/>
+              <w:keepLines/>
+              <w:spacing w:after="0"/>
+              <w:jc w:val="right"/>
+            </w:pPr>
+            <w:r>
+              <w:rPr>
+                <w:sz w:val="18"/>
+                <w:szCs w:val="18"/>
+              </w:rPr>
+              <w:t xml:space="preserve">1,848</w:t>
+            </w:r>
+          </w:p>
+        </w:tc>
+        <w:tc>
+          <w:tcPr>
+            <w:tcW w:type="dxa" w:w="1250"/>
+            <w:tcBorders>
+              <w:top w:val="single" w:color="BFBFBF" w:sz="4"/>
+              <w:left w:val="single" w:color="BFBFBF" w:sz="4"/>
+              <w:bottom w:val="single" w:color="BFBFBF" w:sz="4"/>
+              <w:right w:val="single" w:color="BFBFBF" w:sz="4"/>
+            </w:tcBorders>
+            <w:tcMar>
+              <w:top w:type="dxa" w:w="60"/>
+              <w:left w:type="dxa" w:w="100"/>
+              <w:bottom w:type="dxa" w:w="60"/>
+              <w:right w:type="dxa" w:w="100"/>
+            </w:tcMar>
+          </w:tcPr>
+          <w:p>
+            <w:pPr>
+              <w:keepNext/>
+              <w:keepLines/>
+              <w:spacing w:after="0"/>
+              <w:jc w:val="right"/>
+            </w:pPr>
+            <w:r>
+              <w:rPr>
+                <w:sz w:val="18"/>
+                <w:szCs w:val="18"/>
+              </w:rPr>
+              <w:t xml:space="preserve">546</w:t>
+            </w:r>
+          </w:p>
+        </w:tc>
+        <w:tc>
+          <w:tcPr>
+            <w:tcW w:type="dxa" w:w="1300"/>
+            <w:tcBorders>
+              <w:top w:val="single" w:color="BFBFBF" w:sz="4"/>
+              <w:left w:val="single" w:color="BFBFBF" w:sz="4"/>
+              <w:bottom w:val="single" w:color="BFBFBF" w:sz="4"/>
+              <w:right w:val="single" w:color="BFBFBF" w:sz="4"/>
+            </w:tcBorders>
+            <w:tcMar>
+              <w:top w:type="dxa" w:w="60"/>
+              <w:left w:type="dxa" w:w="100"/>
+              <w:bottom w:type="dxa" w:w="60"/>
+              <w:right w:type="dxa" w:w="100"/>
+            </w:tcMar>
+          </w:tcPr>
+          <w:p>
+            <w:pPr>
+              <w:keepNext/>
+              <w:keepLines/>
+              <w:spacing w:after="0"/>
+              <w:jc w:val="right"/>
+            </w:pPr>
+            <w:r>
+              <w:rPr>
+                <w:sz w:val="18"/>
+                <w:szCs w:val="18"/>
+              </w:rPr>
+              <w:t xml:space="preserve">605</w:t>
+            </w:r>
+          </w:p>
+        </w:tc>
+        <w:tc>
+          <w:tcPr>
+            <w:tcW w:type="dxa" w:w="1250"/>
+            <w:tcBorders>
+              <w:top w:val="single" w:color="BFBFBF" w:sz="4"/>
+              <w:left w:val="single" w:color="BFBFBF" w:sz="4"/>
+              <w:bottom w:val="single" w:color="BFBFBF" w:sz="4"/>
+              <w:right w:val="single" w:color="BFBFBF" w:sz="4"/>
+            </w:tcBorders>
+            <w:tcMar>
+              <w:top w:type="dxa" w:w="60"/>
+              <w:left w:type="dxa" w:w="100"/>
+              <w:bottom w:type="dxa" w:w="60"/>
+              <w:right w:type="dxa" w:w="100"/>
+            </w:tcMar>
+          </w:tcPr>
+          <w:p>
+            <w:pPr>
+              <w:keepNext/>
+              <w:keepLines/>
+              <w:spacing w:after="0"/>
+              <w:jc w:val="right"/>
+            </w:pPr>
+            <w:r>
+              <w:rPr>
+                <w:sz w:val="18"/>
+                <w:szCs w:val="18"/>
+              </w:rPr>
+              <w:t xml:space="preserve">597</w:t>
+            </w:r>
+          </w:p>
+        </w:tc>
+        <w:tc>
+          <w:tcPr>
+            <w:tcW w:type="dxa" w:w="1350"/>
+            <w:tcBorders>
+              <w:top w:val="single" w:color="BFBFBF" w:sz="4"/>
+              <w:left w:val="single" w:color="BFBFBF" w:sz="4"/>
+              <w:bottom w:val="single" w:color="BFBFBF" w:sz="4"/>
+              <w:right w:val="single" w:color="BFBFBF" w:sz="4"/>
+            </w:tcBorders>
+            <w:tcMar>
+              <w:top w:type="dxa" w:w="60"/>
+              <w:left w:type="dxa" w:w="100"/>
+              <w:bottom w:type="dxa" w:w="60"/>
+              <w:right w:type="dxa" w:w="100"/>
+            </w:tcMar>
+          </w:tcPr>
+          <w:p>
+            <w:pPr>
+              <w:keepNext/>
+              <w:keepLines/>
+              <w:spacing w:after="0"/>
+              <w:jc w:val="right"/>
+            </w:pPr>
+            <w:r>
+              <w:rPr>
+                <w:sz w:val="18"/>
+                <w:szCs w:val="18"/>
+              </w:rPr>
+              <w:t xml:space="preserve">Pooled</w:t>
+            </w:r>
+          </w:p>
+        </w:tc>
+        <w:tc>
+          <w:tcPr>
+            <w:tcW w:type="dxa" w:w="1588"/>
+            <w:tcBorders>
+              <w:top w:val="single" w:color="BFBFBF" w:sz="4"/>
+              <w:left w:val="single" w:color="BFBFBF" w:sz="4"/>
+              <w:bottom w:val="single" w:color="BFBFBF" w:sz="4"/>
+              <w:right w:val="single" w:color="BFBFBF" w:sz="4"/>
+            </w:tcBorders>
+            <w:tcMar>
+              <w:top w:type="dxa" w:w="60"/>
+              <w:left w:type="dxa" w:w="100"/>
+              <w:bottom w:type="dxa" w:w="60"/>
+              <w:right w:type="dxa" w:w="100"/>
+            </w:tcMar>
+          </w:tcPr>
+          <w:p>
+            <w:pPr>
+              <w:keepNext/>
+              <w:keepLines/>
+              <w:spacing w:after="0"/>
+              <w:jc w:val="right"/>
+            </w:pPr>
+            <w:r>
+              <w:rPr>
+                <w:sz w:val="18"/>
+                <w:szCs w:val="18"/>
+              </w:rPr>
+              <w:t xml:space="preserve">0</w:t>
+            </w:r>
+          </w:p>
+        </w:tc>
+      </w:tr>
+      <w:tr>
+        <w:trPr>
+          <w:cantSplit/>
+        </w:trPr>
+        <w:tc>
+          <w:tcPr>
+            <w:tcW w:type="dxa" w:w="1800"/>
+            <w:tcBorders>
+              <w:top w:val="single" w:color="BFBFBF" w:sz="4"/>
+              <w:left w:val="single" w:color="BFBFBF" w:sz="4"/>
+              <w:bottom w:val="single" w:color="BFBFBF" w:sz="4"/>
+              <w:right w:val="single" w:color="BFBFBF" w:sz="4"/>
+            </w:tcBorders>
+            <w:tcMar>
+              <w:top w:type="dxa" w:w="60"/>
+              <w:left w:type="dxa" w:w="100"/>
+              <w:bottom w:type="dxa" w:w="60"/>
+              <w:right w:type="dxa" w:w="100"/>
+            </w:tcMar>
+          </w:tcPr>
+          <w:p>
+            <w:pPr>
+              <w:keepNext/>
+              <w:keepLines/>
+              <w:spacing w:after="0"/>
+              <w:jc w:val="left"/>
+            </w:pPr>
+            <w:r>
+              <w:rPr>
+                <w:sz w:val="18"/>
+                <w:szCs w:val="18"/>
+              </w:rPr>
+              <w:t xml:space="preserve">Total</w:t>
+            </w:r>
+          </w:p>
+        </w:tc>
+        <w:tc>
+          <w:tcPr>
+            <w:tcW w:type="dxa" w:w="1100"/>
+            <w:tcBorders>
+              <w:top w:val="single" w:color="BFBFBF" w:sz="4"/>
+              <w:left w:val="single" w:color="BFBFBF" w:sz="4"/>
+              <w:bottom w:val="single" w:color="BFBFBF" w:sz="4"/>
+              <w:right w:val="single" w:color="BFBFBF" w:sz="4"/>
+            </w:tcBorders>
+            <w:tcMar>
+              <w:top w:type="dxa" w:w="60"/>
+              <w:left w:type="dxa" w:w="100"/>
+              <w:bottom w:type="dxa" w:w="60"/>
+              <w:right w:type="dxa" w:w="100"/>
+            </w:tcMar>
+          </w:tcPr>
+          <w:p>
+            <w:pPr>
+              <w:keepNext/>
+              <w:keepLines/>
+              <w:spacing w:after="0"/>
+              <w:jc w:val="right"/>
+            </w:pPr>
+            <w:r>
+              <w:rPr>
+                <w:sz w:val="18"/>
+                <w:szCs w:val="18"/>
+              </w:rPr>
+              <w:t xml:space="preserve">70,662</w:t>
+            </w:r>
+          </w:p>
+        </w:tc>
+        <w:tc>
+          <w:tcPr>
+            <w:tcW w:type="dxa" w:w="1250"/>
+            <w:tcBorders>
+              <w:top w:val="single" w:color="BFBFBF" w:sz="4"/>
+              <w:left w:val="single" w:color="BFBFBF" w:sz="4"/>
+              <w:bottom w:val="single" w:color="BFBFBF" w:sz="4"/>
+              <w:right w:val="single" w:color="BFBFBF" w:sz="4"/>
+            </w:tcBorders>
+            <w:tcMar>
+              <w:top w:type="dxa" w:w="60"/>
+              <w:left w:type="dxa" w:w="100"/>
+              <w:bottom w:type="dxa" w:w="60"/>
+              <w:right w:type="dxa" w:w="100"/>
+            </w:tcMar>
+          </w:tcPr>
+          <w:p>
+            <w:pPr>
+              <w:keepNext/>
+              <w:keepLines/>
+              <w:spacing w:after="0"/>
+              <w:jc w:val="right"/>
+            </w:pPr>
+            <w:r>
+              <w:rPr>
+                <w:sz w:val="18"/>
+                <w:szCs w:val="18"/>
+              </w:rPr>
+              <w:t xml:space="preserve">32,588</w:t>
+            </w:r>
+          </w:p>
+        </w:tc>
+        <w:tc>
+          <w:tcPr>
+            <w:tcW w:type="dxa" w:w="1300"/>
+            <w:tcBorders>
+              <w:top w:val="single" w:color="BFBFBF" w:sz="4"/>
+              <w:left w:val="single" w:color="BFBFBF" w:sz="4"/>
+              <w:bottom w:val="single" w:color="BFBFBF" w:sz="4"/>
+              <w:right w:val="single" w:color="BFBFBF" w:sz="4"/>
+            </w:tcBorders>
+            <w:tcMar>
+              <w:top w:type="dxa" w:w="60"/>
+              <w:left w:type="dxa" w:w="100"/>
+              <w:bottom w:type="dxa" w:w="60"/>
+              <w:right w:type="dxa" w:w="100"/>
+            </w:tcMar>
+          </w:tcPr>
+          <w:p>
+            <w:pPr>
+              <w:keepNext/>
+              <w:keepLines/>
+              <w:spacing w:after="0"/>
+              <w:jc w:val="right"/>
+            </w:pPr>
+            <w:r>
+              <w:rPr>
+                <w:sz w:val="18"/>
+                <w:szCs w:val="18"/>
+              </w:rPr>
+              <w:t xml:space="preserve">32,601</w:t>
+            </w:r>
+          </w:p>
+        </w:tc>
+        <w:tc>
+          <w:tcPr>
+            <w:tcW w:type="dxa" w:w="1250"/>
+            <w:tcBorders>
+              <w:top w:val="single" w:color="BFBFBF" w:sz="4"/>
+              <w:left w:val="single" w:color="BFBFBF" w:sz="4"/>
+              <w:bottom w:val="single" w:color="BFBFBF" w:sz="4"/>
+              <w:right w:val="single" w:color="BFBFBF" w:sz="4"/>
+            </w:tcBorders>
+            <w:tcMar>
+              <w:top w:type="dxa" w:w="60"/>
+              <w:left w:type="dxa" w:w="100"/>
+              <w:bottom w:type="dxa" w:w="60"/>
+              <w:right w:type="dxa" w:w="100"/>
+            </w:tcMar>
+          </w:tcPr>
+          <w:p>
+            <w:pPr>
+              <w:keepNext/>
+              <w:keepLines/>
+              <w:spacing w:after="0"/>
+              <w:jc w:val="right"/>
+            </w:pPr>
+            <w:r>
+              <w:rPr>
+                <w:sz w:val="18"/>
+                <w:szCs w:val="18"/>
+              </w:rPr>
+              <w:t xml:space="preserve">33,148</w:t>
+            </w:r>
+          </w:p>
+        </w:tc>
+        <w:tc>
+          <w:tcPr>
+            <w:tcW w:type="dxa" w:w="1350"/>
+            <w:tcBorders>
+              <w:top w:val="single" w:color="BFBFBF" w:sz="4"/>
+              <w:left w:val="single" w:color="BFBFBF" w:sz="4"/>
+              <w:bottom w:val="single" w:color="BFBFBF" w:sz="4"/>
+              <w:right w:val="single" w:color="BFBFBF" w:sz="4"/>
+            </w:tcBorders>
+            <w:tcMar>
+              <w:top w:type="dxa" w:w="60"/>
+              <w:left w:type="dxa" w:w="100"/>
+              <w:bottom w:type="dxa" w:w="60"/>
+              <w:right w:type="dxa" w:w="100"/>
+            </w:tcMar>
+          </w:tcPr>
+          <w:p>
+            <w:pPr>
+              <w:keepNext/>
+              <w:keepLines/>
+              <w:spacing w:after="0"/>
+              <w:jc w:val="right"/>
+            </w:pPr>
+          </w:p>
+        </w:tc>
+        <w:tc>
+          <w:tcPr>
+            <w:tcW w:type="dxa" w:w="1588"/>
+            <w:tcBorders>
+              <w:top w:val="single" w:color="BFBFBF" w:sz="4"/>
+              <w:left w:val="single" w:color="BFBFBF" w:sz="4"/>
+              <w:bottom w:val="single" w:color="BFBFBF" w:sz="4"/>
+              <w:right w:val="single" w:color="BFBFBF" w:sz="4"/>
+            </w:tcBorders>
+            <w:tcMar>
+              <w:top w:type="dxa" w:w="60"/>
+              <w:left w:type="dxa" w:w="100"/>
+              <w:bottom w:type="dxa" w:w="60"/>
+              <w:right w:type="dxa" w:w="100"/>
+            </w:tcMar>
+          </w:tcPr>
+          <w:p>
+            <w:pPr>
+              <w:keepNext/>
+              <w:keepLines/>
+              <w:spacing w:after="0"/>
+              <w:jc w:val="right"/>
+            </w:pPr>
+            <w:r>
+              <w:rPr>
+                <w:sz w:val="18"/>
+                <w:szCs w:val="18"/>
+              </w:rPr>
+              <w:t xml:space="preserve">+578</w:t>
+            </w:r>
+          </w:p>
+        </w:tc>
+      </w:tr>
+    </w:tbl>
+    <w:p>
+      <w:pPr>
+        <w:spacing w:after="200" w:before="60"/>
+        <w:jc w:val="left"/>
+      </w:pPr>
+      <w:r>
+        <w:rPr>
+          <w:color w:val="52514E"/>
+          <w:sz w:val="18"/>
+          <w:szCs w:val="18"/>
+        </w:rPr>
+        <w:t xml:space="preserve">Table 6. Correct suggestions (top-4 hits) on the test trips. Last column: choosing Own or Pooled per market as validation indicates, compared with one pooled model for every market (results/business_value.csv).</w:t>
       </w:r>
     </w:p>
     <w:p>
       <w:pPr>
-        <w:pStyle w:val="ListParagraph"/>
-        <w:numPr>
-          <w:ilvl w:val="0"/>
-          <w:numId w:val="3"/>
-        </w:numPr>
-        <w:spacing w:after="60" w:line="276"/>
-      </w:pPr>
+        <w:spacing w:after="120" w:line="288"/>
+        <w:jc w:val="both"/>
+      </w:pPr>
+      <w:r>
+        <w:t xml:space="preserve">Compared with one pooled model for everyone, the per-market choice produced </w:t>
+      </w:r>
       <w:r>
         <w:rPr>
           <w:b/>
           <w:bCs/>
         </w:rPr>
-        <w:t xml:space="preserve">Measure distinctiveness early.</w:t>
-      </w:r>
-      <w:r>
-        <w:t xml:space="preserve"> The JS divergence of a market's booked cities can be computed from a small sample of bookings and signals whether the market will soon need its own model.</w:t>
-      </w:r>
-    </w:p>
-    <w:p>
-      <w:pPr>
-        <w:pStyle w:val="ListParagraph"/>
-        <w:numPr>
-          <w:ilvl w:val="0"/>
-          <w:numId w:val="3"/>
-        </w:numPr>
-        <w:spacing w:after="60" w:line="276"/>
-      </w:pPr>
+        <w:t xml:space="preserve">578 more correct suggestions</w:t>
+      </w:r>
+      <w:r>
+        <w:t xml:space="preserve"> (+406 for The Devilfire Empire, +172 for Tcherkistan), and the blend produced </w:t>
+      </w:r>
       <w:r>
         <w:rPr>
           <w:b/>
           <w:bCs/>
         </w:rPr>
-        <w:t xml:space="preserve">Let validation data set the mix and re-tune it as the market grows.</w:t>
-      </w:r>
-      <w:r>
-        <w:t xml:space="preserve"> In this data, re-tuning α moved the model from 0.2 to 0.8 own-weight as Tcherkistan grew, without any manual decision.</w:t>
+        <w:t xml:space="preserve">547 more</w:t>
+      </w:r>
+      <w:r>
+        <w:t xml:space="preserve"> (33,148 vs 32,601). Compared with a separate own-market model for every market, the blend produced 560 more. These counts cover a single test sample; at platform scale the same rates would apply to every multi-city trip planned by these markets.</w:t>
       </w:r>
     </w:p>
     <w:p>
       <w:pPr>
-        <w:pStyle w:val="ListParagraph"/>
-        <w:numPr>
-          <w:ilvl w:val="0"/>
-          <w:numId w:val="3"/>
-        </w:numPr>
-        <w:spacing w:after="60" w:line="276"/>
+        <w:pStyle w:val="Heading2"/>
+      </w:pPr>
+      <w:r>
+        <w:t xml:space="preserve">6.3 Decision rules for the platform</w:t>
+      </w:r>
+    </w:p>
+    <w:tbl>
+      <w:tblPr>
+        <w:tblW w:type="dxa" w:w="9638"/>
+        <w:tblBorders>
+          <w:top w:val="single" w:color="auto" w:sz="4"/>
+          <w:left w:val="single" w:color="auto" w:sz="4"/>
+          <w:bottom w:val="single" w:color="auto" w:sz="4"/>
+          <w:right w:val="single" w:color="auto" w:sz="4"/>
+          <w:insideH w:val="single" w:color="auto" w:sz="4"/>
+          <w:insideV w:val="single" w:color="auto" w:sz="4"/>
+        </w:tblBorders>
+      </w:tblPr>
+      <w:tblGrid>
+        <w:gridCol w:w="2500"/>
+        <w:gridCol w:w="2700"/>
+        <w:gridCol w:w="4438"/>
+      </w:tblGrid>
+      <w:tr>
+        <w:trPr>
+          <w:cantSplit/>
+          <w:tblHeader/>
+        </w:trPr>
+        <w:tc>
+          <w:tcPr>
+            <w:tcW w:type="dxa" w:w="2500"/>
+            <w:tcBorders>
+              <w:top w:val="single" w:color="BFBFBF" w:sz="4"/>
+              <w:left w:val="single" w:color="BFBFBF" w:sz="4"/>
+              <w:bottom w:val="single" w:color="BFBFBF" w:sz="4"/>
+              <w:right w:val="single" w:color="BFBFBF" w:sz="4"/>
+            </w:tcBorders>
+            <w:shd w:fill="E8EEF6" w:color="auto" w:val="clear"/>
+            <w:tcMar>
+              <w:top w:type="dxa" w:w="60"/>
+              <w:left w:type="dxa" w:w="100"/>
+              <w:bottom w:type="dxa" w:w="60"/>
+              <w:right w:type="dxa" w:w="100"/>
+            </w:tcMar>
+          </w:tcPr>
+          <w:p>
+            <w:pPr>
+              <w:keepNext/>
+              <w:keepLines/>
+              <w:spacing w:after="0"/>
+              <w:jc w:val="left"/>
+            </w:pPr>
+            <w:r>
+              <w:rPr>
+                <w:b/>
+                <w:bCs/>
+                <w:sz w:val="18"/>
+                <w:szCs w:val="18"/>
+              </w:rPr>
+              <w:t xml:space="preserve">Situation</w:t>
+            </w:r>
+          </w:p>
+        </w:tc>
+        <w:tc>
+          <w:tcPr>
+            <w:tcW w:type="dxa" w:w="2700"/>
+            <w:tcBorders>
+              <w:top w:val="single" w:color="BFBFBF" w:sz="4"/>
+              <w:left w:val="single" w:color="BFBFBF" w:sz="4"/>
+              <w:bottom w:val="single" w:color="BFBFBF" w:sz="4"/>
+              <w:right w:val="single" w:color="BFBFBF" w:sz="4"/>
+            </w:tcBorders>
+            <w:shd w:fill="E8EEF6" w:color="auto" w:val="clear"/>
+            <w:tcMar>
+              <w:top w:type="dxa" w:w="60"/>
+              <w:left w:type="dxa" w:w="100"/>
+              <w:bottom w:type="dxa" w:w="60"/>
+              <w:right w:type="dxa" w:w="100"/>
+            </w:tcMar>
+          </w:tcPr>
+          <w:p>
+            <w:pPr>
+              <w:keepNext/>
+              <w:keepLines/>
+              <w:spacing w:after="0"/>
+              <w:jc w:val="left"/>
+            </w:pPr>
+            <w:r>
+              <w:rPr>
+                <w:b/>
+                <w:bCs/>
+                <w:sz w:val="18"/>
+                <w:szCs w:val="18"/>
+              </w:rPr>
+              <w:t xml:space="preserve">Recommended training data</w:t>
+            </w:r>
+          </w:p>
+        </w:tc>
+        <w:tc>
+          <w:tcPr>
+            <w:tcW w:type="dxa" w:w="4438"/>
+            <w:tcBorders>
+              <w:top w:val="single" w:color="BFBFBF" w:sz="4"/>
+              <w:left w:val="single" w:color="BFBFBF" w:sz="4"/>
+              <w:bottom w:val="single" w:color="BFBFBF" w:sz="4"/>
+              <w:right w:val="single" w:color="BFBFBF" w:sz="4"/>
+            </w:tcBorders>
+            <w:shd w:fill="E8EEF6" w:color="auto" w:val="clear"/>
+            <w:tcMar>
+              <w:top w:type="dxa" w:w="60"/>
+              <w:left w:type="dxa" w:w="100"/>
+              <w:bottom w:type="dxa" w:w="60"/>
+              <w:right w:type="dxa" w:w="100"/>
+            </w:tcMar>
+          </w:tcPr>
+          <w:p>
+            <w:pPr>
+              <w:keepNext/>
+              <w:keepLines/>
+              <w:spacing w:after="0"/>
+              <w:jc w:val="left"/>
+            </w:pPr>
+            <w:r>
+              <w:rPr>
+                <w:b/>
+                <w:bCs/>
+                <w:sz w:val="18"/>
+                <w:szCs w:val="18"/>
+              </w:rPr>
+              <w:t xml:space="preserve">Evidence in this report</w:t>
+            </w:r>
+          </w:p>
+        </w:tc>
+      </w:tr>
+      <w:tr>
+        <w:trPr>
+          <w:cantSplit/>
+        </w:trPr>
+        <w:tc>
+          <w:tcPr>
+            <w:tcW w:type="dxa" w:w="2500"/>
+            <w:tcBorders>
+              <w:top w:val="single" w:color="BFBFBF" w:sz="4"/>
+              <w:left w:val="single" w:color="BFBFBF" w:sz="4"/>
+              <w:bottom w:val="single" w:color="BFBFBF" w:sz="4"/>
+              <w:right w:val="single" w:color="BFBFBF" w:sz="4"/>
+            </w:tcBorders>
+            <w:tcMar>
+              <w:top w:type="dxa" w:w="60"/>
+              <w:left w:type="dxa" w:w="100"/>
+              <w:bottom w:type="dxa" w:w="60"/>
+              <w:right w:type="dxa" w:w="100"/>
+            </w:tcMar>
+          </w:tcPr>
+          <w:p>
+            <w:pPr>
+              <w:keepNext/>
+              <w:keepLines/>
+              <w:spacing w:after="0"/>
+              <w:jc w:val="left"/>
+            </w:pPr>
+            <w:r>
+              <w:rPr>
+                <w:sz w:val="18"/>
+                <w:szCs w:val="18"/>
+              </w:rPr>
+              <w:t xml:space="preserve">New market, fewer than about 1,000 own trips</w:t>
+            </w:r>
+          </w:p>
+        </w:tc>
+        <w:tc>
+          <w:tcPr>
+            <w:tcW w:type="dxa" w:w="2700"/>
+            <w:tcBorders>
+              <w:top w:val="single" w:color="BFBFBF" w:sz="4"/>
+              <w:left w:val="single" w:color="BFBFBF" w:sz="4"/>
+              <w:bottom w:val="single" w:color="BFBFBF" w:sz="4"/>
+              <w:right w:val="single" w:color="BFBFBF" w:sz="4"/>
+            </w:tcBorders>
+            <w:tcMar>
+              <w:top w:type="dxa" w:w="60"/>
+              <w:left w:type="dxa" w:w="100"/>
+              <w:bottom w:type="dxa" w:w="60"/>
+              <w:right w:type="dxa" w:w="100"/>
+            </w:tcMar>
+          </w:tcPr>
+          <w:p>
+            <w:pPr>
+              <w:keepNext/>
+              <w:keepLines/>
+              <w:spacing w:after="0"/>
+              <w:jc w:val="left"/>
+            </w:pPr>
+            <w:r>
+              <w:rPr>
+                <w:sz w:val="18"/>
+                <w:szCs w:val="18"/>
+              </w:rPr>
+              <w:t xml:space="preserve">Pooled, or a blend with low own weight</w:t>
+            </w:r>
+          </w:p>
+        </w:tc>
+        <w:tc>
+          <w:tcPr>
+            <w:tcW w:type="dxa" w:w="4438"/>
+            <w:tcBorders>
+              <w:top w:val="single" w:color="BFBFBF" w:sz="4"/>
+              <w:left w:val="single" w:color="BFBFBF" w:sz="4"/>
+              <w:bottom w:val="single" w:color="BFBFBF" w:sz="4"/>
+              <w:right w:val="single" w:color="BFBFBF" w:sz="4"/>
+            </w:tcBorders>
+            <w:tcMar>
+              <w:top w:type="dxa" w:w="60"/>
+              <w:left w:type="dxa" w:w="100"/>
+              <w:bottom w:type="dxa" w:w="60"/>
+              <w:right w:type="dxa" w:w="100"/>
+            </w:tcMar>
+          </w:tcPr>
+          <w:p>
+            <w:pPr>
+              <w:keepNext/>
+              <w:keepLines/>
+              <w:spacing w:after="0"/>
+              <w:jc w:val="left"/>
+            </w:pPr>
+            <w:r>
+              <w:rPr>
+                <w:sz w:val="18"/>
+                <w:szCs w:val="18"/>
+              </w:rPr>
+              <w:t xml:space="preserve">Tcherkistan at 250 trips: blend 58.9%, pooled 57.1%, own 55.9%. Elbonia at 250 trips: pooled 35.5%, own 18.6% (Table 5)</w:t>
+            </w:r>
+          </w:p>
+        </w:tc>
+      </w:tr>
+      <w:tr>
+        <w:trPr>
+          <w:cantSplit/>
+        </w:trPr>
+        <w:tc>
+          <w:tcPr>
+            <w:tcW w:type="dxa" w:w="2500"/>
+            <w:tcBorders>
+              <w:top w:val="single" w:color="BFBFBF" w:sz="4"/>
+              <w:left w:val="single" w:color="BFBFBF" w:sz="4"/>
+              <w:bottom w:val="single" w:color="BFBFBF" w:sz="4"/>
+              <w:right w:val="single" w:color="BFBFBF" w:sz="4"/>
+            </w:tcBorders>
+            <w:tcMar>
+              <w:top w:type="dxa" w:w="60"/>
+              <w:left w:type="dxa" w:w="100"/>
+              <w:bottom w:type="dxa" w:w="60"/>
+              <w:right w:type="dxa" w:w="100"/>
+            </w:tcMar>
+          </w:tcPr>
+          <w:p>
+            <w:pPr>
+              <w:keepNext/>
+              <w:keepLines/>
+              <w:spacing w:after="0"/>
+              <w:jc w:val="left"/>
+            </w:pPr>
+            <w:r>
+              <w:rPr>
+                <w:sz w:val="18"/>
+                <w:szCs w:val="18"/>
+              </w:rPr>
+              <w:t xml:space="preserve">Distinctive market with enough data</w:t>
+            </w:r>
+          </w:p>
+        </w:tc>
+        <w:tc>
+          <w:tcPr>
+            <w:tcW w:type="dxa" w:w="2700"/>
+            <w:tcBorders>
+              <w:top w:val="single" w:color="BFBFBF" w:sz="4"/>
+              <w:left w:val="single" w:color="BFBFBF" w:sz="4"/>
+              <w:bottom w:val="single" w:color="BFBFBF" w:sz="4"/>
+              <w:right w:val="single" w:color="BFBFBF" w:sz="4"/>
+            </w:tcBorders>
+            <w:tcMar>
+              <w:top w:type="dxa" w:w="60"/>
+              <w:left w:type="dxa" w:w="100"/>
+              <w:bottom w:type="dxa" w:w="60"/>
+              <w:right w:type="dxa" w:w="100"/>
+            </w:tcMar>
+          </w:tcPr>
+          <w:p>
+            <w:pPr>
+              <w:keepNext/>
+              <w:keepLines/>
+              <w:spacing w:after="0"/>
+              <w:jc w:val="left"/>
+            </w:pPr>
+            <w:r>
+              <w:rPr>
+                <w:sz w:val="18"/>
+                <w:szCs w:val="18"/>
+              </w:rPr>
+              <w:t xml:space="preserve">Own, or a blend with high own weight</w:t>
+            </w:r>
+          </w:p>
+        </w:tc>
+        <w:tc>
+          <w:tcPr>
+            <w:tcW w:type="dxa" w:w="4438"/>
+            <w:tcBorders>
+              <w:top w:val="single" w:color="BFBFBF" w:sz="4"/>
+              <w:left w:val="single" w:color="BFBFBF" w:sz="4"/>
+              <w:bottom w:val="single" w:color="BFBFBF" w:sz="4"/>
+              <w:right w:val="single" w:color="BFBFBF" w:sz="4"/>
+            </w:tcBorders>
+            <w:tcMar>
+              <w:top w:type="dxa" w:w="60"/>
+              <w:left w:type="dxa" w:w="100"/>
+              <w:bottom w:type="dxa" w:w="60"/>
+              <w:right w:type="dxa" w:w="100"/>
+            </w:tcMar>
+          </w:tcPr>
+          <w:p>
+            <w:pPr>
+              <w:keepNext/>
+              <w:keepLines/>
+              <w:spacing w:after="0"/>
+              <w:jc w:val="left"/>
+            </w:pPr>
+            <w:r>
+              <w:rPr>
+                <w:sz w:val="18"/>
+                <w:szCs w:val="18"/>
+              </w:rPr>
+              <w:t xml:space="preserve">Tcherkistan and The Devilfire Empire: own wins by 3.2 and 2.4 points; +172 and +406 correct suggestions (Tables 4, 6)</w:t>
+            </w:r>
+          </w:p>
+        </w:tc>
+      </w:tr>
+      <w:tr>
+        <w:trPr>
+          <w:cantSplit/>
+        </w:trPr>
+        <w:tc>
+          <w:tcPr>
+            <w:tcW w:type="dxa" w:w="2500"/>
+            <w:tcBorders>
+              <w:top w:val="single" w:color="BFBFBF" w:sz="4"/>
+              <w:left w:val="single" w:color="BFBFBF" w:sz="4"/>
+              <w:bottom w:val="single" w:color="BFBFBF" w:sz="4"/>
+              <w:right w:val="single" w:color="BFBFBF" w:sz="4"/>
+            </w:tcBorders>
+            <w:tcMar>
+              <w:top w:type="dxa" w:w="60"/>
+              <w:left w:type="dxa" w:w="100"/>
+              <w:bottom w:type="dxa" w:w="60"/>
+              <w:right w:type="dxa" w:w="100"/>
+            </w:tcMar>
+          </w:tcPr>
+          <w:p>
+            <w:pPr>
+              <w:keepNext/>
+              <w:keepLines/>
+              <w:spacing w:after="0"/>
+              <w:jc w:val="left"/>
+            </w:pPr>
+            <w:r>
+              <w:rPr>
+                <w:sz w:val="18"/>
+                <w:szCs w:val="18"/>
+              </w:rPr>
+              <w:t xml:space="preserve">Typical market (low distinctiveness)</w:t>
+            </w:r>
+          </w:p>
+        </w:tc>
+        <w:tc>
+          <w:tcPr>
+            <w:tcW w:type="dxa" w:w="2700"/>
+            <w:tcBorders>
+              <w:top w:val="single" w:color="BFBFBF" w:sz="4"/>
+              <w:left w:val="single" w:color="BFBFBF" w:sz="4"/>
+              <w:bottom w:val="single" w:color="BFBFBF" w:sz="4"/>
+              <w:right w:val="single" w:color="BFBFBF" w:sz="4"/>
+            </w:tcBorders>
+            <w:tcMar>
+              <w:top w:type="dxa" w:w="60"/>
+              <w:left w:type="dxa" w:w="100"/>
+              <w:bottom w:type="dxa" w:w="60"/>
+              <w:right w:type="dxa" w:w="100"/>
+            </w:tcMar>
+          </w:tcPr>
+          <w:p>
+            <w:pPr>
+              <w:keepNext/>
+              <w:keepLines/>
+              <w:spacing w:after="0"/>
+              <w:jc w:val="left"/>
+            </w:pPr>
+            <w:r>
+              <w:rPr>
+                <w:sz w:val="18"/>
+                <w:szCs w:val="18"/>
+              </w:rPr>
+              <w:t xml:space="preserve">Pooled, at every size</w:t>
+            </w:r>
+          </w:p>
+        </w:tc>
+        <w:tc>
+          <w:tcPr>
+            <w:tcW w:type="dxa" w:w="4438"/>
+            <w:tcBorders>
+              <w:top w:val="single" w:color="BFBFBF" w:sz="4"/>
+              <w:left w:val="single" w:color="BFBFBF" w:sz="4"/>
+              <w:bottom w:val="single" w:color="BFBFBF" w:sz="4"/>
+              <w:right w:val="single" w:color="BFBFBF" w:sz="4"/>
+            </w:tcBorders>
+            <w:tcMar>
+              <w:top w:type="dxa" w:w="60"/>
+              <w:left w:type="dxa" w:w="100"/>
+              <w:bottom w:type="dxa" w:w="60"/>
+              <w:right w:type="dxa" w:w="100"/>
+            </w:tcMar>
+          </w:tcPr>
+          <w:p>
+            <w:pPr>
+              <w:keepNext/>
+              <w:keepLines/>
+              <w:spacing w:after="0"/>
+              <w:jc w:val="left"/>
+            </w:pPr>
+            <w:r>
+              <w:rPr>
+                <w:sz w:val="18"/>
+                <w:szCs w:val="18"/>
+              </w:rPr>
+              <w:t xml:space="preserve">Elbonia and Gondal: pooled wins by 2.1 and 0.8 points (Table 4)</w:t>
+            </w:r>
+          </w:p>
+        </w:tc>
+      </w:tr>
+      <w:tr>
+        <w:trPr>
+          <w:cantSplit/>
+        </w:trPr>
+        <w:tc>
+          <w:tcPr>
+            <w:tcW w:type="dxa" w:w="2500"/>
+            <w:tcBorders>
+              <w:top w:val="single" w:color="BFBFBF" w:sz="4"/>
+              <w:left w:val="single" w:color="BFBFBF" w:sz="4"/>
+              <w:bottom w:val="single" w:color="BFBFBF" w:sz="4"/>
+              <w:right w:val="single" w:color="BFBFBF" w:sz="4"/>
+            </w:tcBorders>
+            <w:tcMar>
+              <w:top w:type="dxa" w:w="60"/>
+              <w:left w:type="dxa" w:w="100"/>
+              <w:bottom w:type="dxa" w:w="60"/>
+              <w:right w:type="dxa" w:w="100"/>
+            </w:tcMar>
+          </w:tcPr>
+          <w:p>
+            <w:pPr>
+              <w:keepNext/>
+              <w:keepLines/>
+              <w:spacing w:after="0"/>
+              <w:jc w:val="left"/>
+            </w:pPr>
+            <w:r>
+              <w:rPr>
+                <w:sz w:val="18"/>
+                <w:szCs w:val="18"/>
+              </w:rPr>
+              <w:t xml:space="preserve">Every market, as it grows</w:t>
+            </w:r>
+          </w:p>
+        </w:tc>
+        <w:tc>
+          <w:tcPr>
+            <w:tcW w:type="dxa" w:w="2700"/>
+            <w:tcBorders>
+              <w:top w:val="single" w:color="BFBFBF" w:sz="4"/>
+              <w:left w:val="single" w:color="BFBFBF" w:sz="4"/>
+              <w:bottom w:val="single" w:color="BFBFBF" w:sz="4"/>
+              <w:right w:val="single" w:color="BFBFBF" w:sz="4"/>
+            </w:tcBorders>
+            <w:tcMar>
+              <w:top w:type="dxa" w:w="60"/>
+              <w:left w:type="dxa" w:w="100"/>
+              <w:bottom w:type="dxa" w:w="60"/>
+              <w:right w:type="dxa" w:w="100"/>
+            </w:tcMar>
+          </w:tcPr>
+          <w:p>
+            <w:pPr>
+              <w:keepNext/>
+              <w:keepLines/>
+              <w:spacing w:after="0"/>
+              <w:jc w:val="left"/>
+            </w:pPr>
+            <w:r>
+              <w:rPr>
+                <w:sz w:val="18"/>
+                <w:szCs w:val="18"/>
+              </w:rPr>
+              <w:t xml:space="preserve">Re-tune α on fresh validation data; report accuracy per market</w:t>
+            </w:r>
+          </w:p>
+        </w:tc>
+        <w:tc>
+          <w:tcPr>
+            <w:tcW w:type="dxa" w:w="4438"/>
+            <w:tcBorders>
+              <w:top w:val="single" w:color="BFBFBF" w:sz="4"/>
+              <w:left w:val="single" w:color="BFBFBF" w:sz="4"/>
+              <w:bottom w:val="single" w:color="BFBFBF" w:sz="4"/>
+              <w:right w:val="single" w:color="BFBFBF" w:sz="4"/>
+            </w:tcBorders>
+            <w:tcMar>
+              <w:top w:type="dxa" w:w="60"/>
+              <w:left w:type="dxa" w:w="100"/>
+              <w:bottom w:type="dxa" w:w="60"/>
+              <w:right w:type="dxa" w:w="100"/>
+            </w:tcMar>
+          </w:tcPr>
+          <w:p>
+            <w:pPr>
+              <w:keepNext/>
+              <w:keepLines/>
+              <w:spacing w:after="0"/>
+              <w:jc w:val="left"/>
+            </w:pPr>
+            <w:r>
+              <w:rPr>
+                <w:sz w:val="18"/>
+                <w:szCs w:val="18"/>
+              </w:rPr>
+              <w:t xml:space="preserve">Tuned α rose from 0.2 to 0.8 as Tcherkistan grew (Table 5)</w:t>
+            </w:r>
+          </w:p>
+        </w:tc>
+      </w:tr>
+    </w:tbl>
+    <w:p>
+      <w:pPr>
+        <w:spacing w:after="200" w:before="60"/>
+        <w:jc w:val="left"/>
       </w:pPr>
       <w:r>
         <w:rPr>
-          <w:b/>
-          <w:bCs/>
+          <w:color w:val="52514E"/>
+          <w:sz w:val="18"/>
+          <w:szCs w:val="18"/>
         </w:rPr>
-        <w:t xml:space="preserve">Monitor minority markets on shared cities.</w:t>
-      </w:r>
-      <w:r>
-        <w:t xml:space="preserve"> The crowding-out effect means one global model systematically serves smaller, different markets worse. This is the fairness concern from Week 7 ("who receives weaker recommendations?"), and per-market reporting, as in Table 3, makes it visible.</w:t>
+        <w:t xml:space="preserve">Table 7. Decision rules derived from the results.</w:t>
       </w:r>
     </w:p>
     <w:p>
@@ -7802,7 +10744,7 @@
         <w:jc w:val="both"/>
       </w:pPr>
       <w:r>
-        <w:t xml:space="preserve">KPI view: across all test trips, choosing the data source per market (blend) raised Recall@4 from 46.1% to 46.9% over either single global rule. For the two distinctive markets, avoiding a pooled-only model recovered about 2.4–3.2 points, about 4–5% relative to their own-model accuracy.</w:t>
+        <w:t xml:space="preserve">Measuring a new market's distinctiveness early could tell the team in advance which row will apply, but this report measured distinctiveness on the full data, so how early it can be estimated reliably remains untested (Section 8).</w:t>
       </w:r>
     </w:p>
     <w:p>
@@ -7810,7 +10752,16 @@
         <w:pStyle w:val="Heading1"/>
       </w:pPr>
       <w:r>
-        <w:t xml:space="preserve">7. Limitations</w:t>
+        <w:t xml:space="preserve">7. Governance and ethics</w:t>
+      </w:r>
+    </w:p>
+    <w:p>
+      <w:pPr>
+        <w:spacing w:after="120" w:line="288"/>
+        <w:jc w:val="both"/>
+      </w:pPr>
+      <w:r>
+        <w:t xml:space="preserve">The course asks every project to connect its metrics to a governance requirement. For this recommender:</w:t>
       </w:r>
     </w:p>
     <w:p>
@@ -7827,10 +10778,10 @@
           <w:b/>
           <w:bCs/>
         </w:rPr>
-        <w:t xml:space="preserve">Only five markets.</w:t>
-      </w:r>
-      <w:r>
-        <w:t xml:space="preserve"> The relationship between distinctiveness and pooling gain in Figure 2 rests on five points and cannot be generalised statistically; Experiment 2 strengthens it for two markets only.</w:t>
+        <w:t xml:space="preserve">Privacy.</w:t>
+      </w:r>
+      <w:r>
+        <w:t xml:space="preserve"> The dataset is anonymised by Booking.com: users, cities and countries are codes, and no personal data was collected or linked. A production version should keep per-market models from re-identifying small groups of travellers.</w:t>
       </w:r>
     </w:p>
     <w:p>
@@ -7847,10 +10798,10 @@
           <w:b/>
           <w:bCs/>
         </w:rPr>
-        <w:t xml:space="preserve">Markets are not cultures.</w:t>
-      </w:r>
-      <w:r>
-        <w:t xml:space="preserve"> booker_country is an anonymised reservation origin, not nationality or culture, and cannot be linked to cultural indicators such as the World Values Survey. The results describe behavioural differences between markets, not cultural causes.</w:t>
+        <w:t xml:space="preserve">Consent and terms.</w:t>
+      </w:r>
+      <w:r>
+        <w:t xml:space="preserve"> The data is used under Booking.com's terms (non-commercial, not harmful or competitive). It is not redistributed with the code; README.md explains how to obtain it.</w:t>
       </w:r>
     </w:p>
     <w:p>
@@ -7867,10 +10818,10 @@
           <w:b/>
           <w:bCs/>
         </w:rPr>
-        <w:t xml:space="preserve">Simple model.</w:t>
-      </w:r>
-      <w:r>
-        <w:t xml:space="preserve"> A first-order transition model ignores trip length, dates, device and longer history. Stronger models (e.g., sequence neural networks) may narrow or change the gaps, although the crowding-out mechanism should still apply to any model trained on pooled counts.</w:t>
+        <w:t xml:space="preserve">Bias and fairness.</w:t>
+      </w:r>
+      <w:r>
+        <w:t xml:space="preserve"> A single global model serves small and distinctive markets worse (crowding-out, Section 5). Accuracy should be reported per market, as in Table 3, not only as one average, so that weaker service to minority markets stays visible.</w:t>
       </w:r>
     </w:p>
     <w:p>
@@ -7887,10 +10838,10 @@
           <w:b/>
           <w:bCs/>
         </w:rPr>
-        <w:t xml:space="preserve">Distinctiveness was measured on the full training data.</w:t>
-      </w:r>
-      <w:r>
-        <w:t xml:space="preserve"> In a real launch it would have to be estimated from the small early sample, which is less precise.</w:t>
+        <w:t xml:space="preserve">Control.</w:t>
+      </w:r>
+      <w:r>
+        <w:t xml:space="preserve"> Recommendations are suggestions in the planning interface, and travellers stay free to choose any city, so a wrong suggestion has low individual risk.</w:t>
       </w:r>
     </w:p>
     <w:p>
@@ -7907,10 +10858,10 @@
           <w:b/>
           <w:bCs/>
         </w:rPr>
-        <w:t xml:space="preserve">One period and one platform.</w:t>
-      </w:r>
-      <w:r>
-        <w:t xml:space="preserve"> The data covers 2016 bookings on one platform, before major changes in travel behaviour; results may not transfer to other periods or domains.</w:t>
+        <w:t xml:space="preserve">Monitoring and ownership.</w:t>
+      </w:r>
+      <w:r>
+        <w:t xml:space="preserve"> The product team that owns the recommender should track Recall@4 per market after each retraining and re-tune α when a market grows or its behaviour changes, as in Table 7.</w:t>
       </w:r>
     </w:p>
     <w:p>
@@ -7927,10 +10878,10 @@
           <w:b/>
           <w:bCs/>
         </w:rPr>
-        <w:t xml:space="preserve">Design choices.</w:t>
-      </w:r>
-      <w:r>
-        <w:t xml:space="preserve"> Allowing repeat stays in the same city raises all scores by about 6–7 points; it does not change the comparison between models, which all share this rule. Ties between equally frequent cities are broken by data order, which causes differences of up to 0.2 points between the full-data rows of Tables 3 and 5.</w:t>
+        <w:t xml:space="preserve">AI use.</w:t>
+      </w:r>
+      <w:r>
+        <w:t xml:space="preserve"> AI assistance in this project is disclosed in the Appendix, and all reported numbers were re-checked by rerunning the notebook.</w:t>
       </w:r>
     </w:p>
     <w:p>
@@ -7938,7 +10889,135 @@
         <w:pStyle w:val="Heading1"/>
       </w:pPr>
       <w:r>
-        <w:t xml:space="preserve">8. Conclusion</w:t>
+        <w:t xml:space="preserve">8. Limitations</w:t>
+      </w:r>
+    </w:p>
+    <w:p>
+      <w:pPr>
+        <w:pStyle w:val="ListParagraph"/>
+        <w:numPr>
+          <w:ilvl w:val="0"/>
+          <w:numId w:val="2"/>
+        </w:numPr>
+        <w:spacing w:after="60" w:line="276"/>
+      </w:pPr>
+      <w:r>
+        <w:rPr>
+          <w:b/>
+          <w:bCs/>
+        </w:rPr>
+        <w:t xml:space="preserve">Only five markets.</w:t>
+      </w:r>
+      <w:r>
+        <w:t xml:space="preserve"> The relationship between distinctiveness and pooling gain in Figure 2 rests on five points and cannot be generalised statistically; Experiment 2 strengthens it for two markets only.</w:t>
+      </w:r>
+    </w:p>
+    <w:p>
+      <w:pPr>
+        <w:pStyle w:val="ListParagraph"/>
+        <w:numPr>
+          <w:ilvl w:val="0"/>
+          <w:numId w:val="2"/>
+        </w:numPr>
+        <w:spacing w:after="60" w:line="276"/>
+      </w:pPr>
+      <w:r>
+        <w:rPr>
+          <w:b/>
+          <w:bCs/>
+        </w:rPr>
+        <w:t xml:space="preserve">Markets are not cultures.</w:t>
+      </w:r>
+      <w:r>
+        <w:t xml:space="preserve"> booker_country is an anonymised reservation origin, not nationality or culture, and cannot be linked to cultural indicators such as the World Values Survey. The results describe behavioural differences between markets, not cultural causes.</w:t>
+      </w:r>
+    </w:p>
+    <w:p>
+      <w:pPr>
+        <w:pStyle w:val="ListParagraph"/>
+        <w:numPr>
+          <w:ilvl w:val="0"/>
+          <w:numId w:val="2"/>
+        </w:numPr>
+        <w:spacing w:after="60" w:line="276"/>
+      </w:pPr>
+      <w:r>
+        <w:rPr>
+          <w:b/>
+          <w:bCs/>
+        </w:rPr>
+        <w:t xml:space="preserve">Simple model.</w:t>
+      </w:r>
+      <w:r>
+        <w:t xml:space="preserve"> A first-order transition model ignores trip length, dates, device and longer history. Stronger models (e.g., sequence neural networks) may narrow or change the gaps, although the crowding-out mechanism should still apply to any model trained on pooled counts.</w:t>
+      </w:r>
+    </w:p>
+    <w:p>
+      <w:pPr>
+        <w:pStyle w:val="ListParagraph"/>
+        <w:numPr>
+          <w:ilvl w:val="0"/>
+          <w:numId w:val="2"/>
+        </w:numPr>
+        <w:spacing w:after="60" w:line="276"/>
+      </w:pPr>
+      <w:r>
+        <w:rPr>
+          <w:b/>
+          <w:bCs/>
+        </w:rPr>
+        <w:t xml:space="preserve">Distinctiveness was measured on the full training data.</w:t>
+      </w:r>
+      <w:r>
+        <w:t xml:space="preserve"> In a real launch it would have to be estimated from the small early sample, which is less precise.</w:t>
+      </w:r>
+    </w:p>
+    <w:p>
+      <w:pPr>
+        <w:pStyle w:val="ListParagraph"/>
+        <w:numPr>
+          <w:ilvl w:val="0"/>
+          <w:numId w:val="2"/>
+        </w:numPr>
+        <w:spacing w:after="60" w:line="276"/>
+      </w:pPr>
+      <w:r>
+        <w:rPr>
+          <w:b/>
+          <w:bCs/>
+        </w:rPr>
+        <w:t xml:space="preserve">One period and one platform.</w:t>
+      </w:r>
+      <w:r>
+        <w:t xml:space="preserve"> The data covers 2016 bookings on one platform, before major changes in travel behaviour; results may not transfer to other periods or domains.</w:t>
+      </w:r>
+    </w:p>
+    <w:p>
+      <w:pPr>
+        <w:pStyle w:val="ListParagraph"/>
+        <w:numPr>
+          <w:ilvl w:val="0"/>
+          <w:numId w:val="2"/>
+        </w:numPr>
+        <w:spacing w:after="60" w:line="276"/>
+      </w:pPr>
+      <w:r>
+        <w:rPr>
+          <w:b/>
+          <w:bCs/>
+        </w:rPr>
+        <w:t xml:space="preserve">Design choices.</w:t>
+      </w:r>
+      <w:r>
+        <w:t xml:space="preserve"> Allowing repeat stays in the same city raises all scores by about 6–7 points; it does not change the comparison between models, which all share this rule. Ties between equally frequent cities are broken by data order, which causes differences of up to 0.2 points between the full-data rows of Tables 3 and 5.</w:t>
+      </w:r>
+    </w:p>
+    <w:p>
+      <w:pPr>
+        <w:pStyle w:val="Heading1"/>
+      </w:pPr>
+      <w:r>
+        <w:t xml:space="preserve">9. Conclusion</w:t>
       </w:r>
     </w:p>
     <w:p>
@@ -8054,7 +11133,7 @@
         <w:t xml:space="preserve">Reproducibility.</w:t>
       </w:r>
       <w:r>
-        <w:t xml:space="preserve"> All numbers, tables and figures in this report are produced by analysis.ipynb (runtime about 2.5 minutes) and saved to results/ and figures/. Random sampling uses fixed seeds. README.md lists the environment, the download step for the dataset and execution instructions.</w:t>
+        <w:t xml:space="preserve"> All numbers, tables and figures in this report are produced by analysis.ipynb (runtime about 3–4 minutes, also in Google Colab) and saved to results/ and figures/. Random sampling uses fixed seeds. README.md lists the environment, the download step for the dataset and execution instructions.</w:t>
       </w:r>
     </w:p>
     <w:p>
@@ -8070,7 +11149,7 @@
         <w:t xml:space="preserve">AI use disclosure.</w:t>
       </w:r>
       <w:r>
-        <w:t xml:space="preserve"> I used an AI assistant (Claude, Anthropic) to help write the analysis code and to draft parts of this report. I defined the project scope with it, reviewed the design choices, ran the notebook, and checked that every number in this report matches the notebook output. The interpretation and conclusions are my responsibility.</w:t>
+        <w:t xml:space="preserve"> The analysis code and the first draft of this report were produced with an AI assistant (Claude, Anthropic), following the project scope I chose. I reran the complete notebook myself in Google Colab and confirmed that all results match this report. The interpretation and conclusions are my responsibility.</w:t>
       </w:r>
     </w:p>
     <w:sectPr>
@@ -8301,12 +11380,6 @@
   </w:num>
   <w:num w:numId="2">
     <w:abstractNumId w:val="2"/>
-    <w:lvlOverride w:ilvl="0">
-      <w:startOverride w:val="1"/>
-    </w:lvlOverride>
-  </w:num>
-  <w:num w:numId="3">
-    <w:abstractNumId w:val="3"/>
     <w:lvlOverride w:ilvl="0">
       <w:startOverride w:val="1"/>
     </w:lvlOverride>

</xml_diff>